<commit_message>
docs: update AI-200 study notes
</commit_message>
<xml_diff>
--- a/Azure/Azure AI Cloud Developer (AI-200).docx
+++ b/Azure/Azure AI Cloud Developer (AI-200).docx
@@ -22,16 +22,25 @@
       <w:r>
         <w:fldChar w:fldCharType="separate"/>
       </w:r>
-      <w:hyperlink w:anchor="_Toc237372509" w:history="1">
+      <w:hyperlink w:anchor="_Toc238020612" w:history="1">
         <w:r>
           <w:rPr>
             <w:rStyle w:val="Hyperlink"/>
+            <w:b/>
+            <w:bCs/>
             <w:noProof/>
           </w:rPr>
           <w:t>Develop containerized solutions on Azure (20–25%)</w:t>
         </w:r>
         <w:r>
           <w:rPr>
+            <w:rStyle w:val="Hyperlink"/>
+            <w:noProof/>
+          </w:rPr>
+          <w:t xml:space="preserve"> Implement container application hosting</w:t>
+        </w:r>
+        <w:r>
+          <w:rPr>
             <w:noProof/>
             <w:webHidden/>
           </w:rPr>
@@ -49,7 +58,7 @@
             <w:noProof/>
             <w:webHidden/>
           </w:rPr>
-          <w:instrText xml:space="preserve"> PAGEREF _Toc237372509 \h </w:instrText>
+          <w:instrText xml:space="preserve"> PAGEREF _Toc238020612 \h </w:instrText>
         </w:r>
         <w:r>
           <w:rPr>
@@ -91,7 +100,7 @@
           <w:noProof/>
         </w:rPr>
       </w:pPr>
-      <w:hyperlink w:anchor="_Toc237372510" w:history="1">
+      <w:hyperlink w:anchor="_Toc238020613" w:history="1">
         <w:r>
           <w:rPr>
             <w:rStyle w:val="Hyperlink"/>
@@ -118,7 +127,7 @@
             <w:noProof/>
             <w:webHidden/>
           </w:rPr>
-          <w:instrText xml:space="preserve"> PAGEREF _Toc237372510 \h </w:instrText>
+          <w:instrText xml:space="preserve"> PAGEREF _Toc238020613 \h </w:instrText>
         </w:r>
         <w:r>
           <w:rPr>
@@ -160,7 +169,7 @@
           <w:noProof/>
         </w:rPr>
       </w:pPr>
-      <w:hyperlink w:anchor="_Toc237372511" w:history="1">
+      <w:hyperlink w:anchor="_Toc238020614" w:history="1">
         <w:r>
           <w:rPr>
             <w:rStyle w:val="Hyperlink"/>
@@ -187,7 +196,7 @@
             <w:noProof/>
             <w:webHidden/>
           </w:rPr>
-          <w:instrText xml:space="preserve"> PAGEREF _Toc237372511 \h </w:instrText>
+          <w:instrText xml:space="preserve"> PAGEREF _Toc238020614 \h </w:instrText>
         </w:r>
         <w:r>
           <w:rPr>
@@ -229,7 +238,7 @@
           <w:noProof/>
         </w:rPr>
       </w:pPr>
-      <w:hyperlink w:anchor="_Toc237372512" w:history="1">
+      <w:hyperlink w:anchor="_Toc238020615" w:history="1">
         <w:r>
           <w:rPr>
             <w:rStyle w:val="Hyperlink"/>
@@ -256,7 +265,7 @@
             <w:noProof/>
             <w:webHidden/>
           </w:rPr>
-          <w:instrText xml:space="preserve"> PAGEREF _Toc237372512 \h </w:instrText>
+          <w:instrText xml:space="preserve"> PAGEREF _Toc238020615 \h </w:instrText>
         </w:r>
         <w:r>
           <w:rPr>
@@ -298,7 +307,7 @@
           <w:noProof/>
         </w:rPr>
       </w:pPr>
-      <w:hyperlink w:anchor="_Toc237372513" w:history="1">
+      <w:hyperlink w:anchor="_Toc238020616" w:history="1">
         <w:r>
           <w:rPr>
             <w:rStyle w:val="Hyperlink"/>
@@ -325,7 +334,7 @@
             <w:noProof/>
             <w:webHidden/>
           </w:rPr>
-          <w:instrText xml:space="preserve"> PAGEREF _Toc237372513 \h </w:instrText>
+          <w:instrText xml:space="preserve"> PAGEREF _Toc238020616 \h </w:instrText>
         </w:r>
         <w:r>
           <w:rPr>
@@ -367,7 +376,7 @@
           <w:noProof/>
         </w:rPr>
       </w:pPr>
-      <w:hyperlink w:anchor="_Toc237372514" w:history="1">
+      <w:hyperlink w:anchor="_Toc238020617" w:history="1">
         <w:r>
           <w:rPr>
             <w:rStyle w:val="Hyperlink"/>
@@ -394,7 +403,7 @@
             <w:noProof/>
             <w:webHidden/>
           </w:rPr>
-          <w:instrText xml:space="preserve"> PAGEREF _Toc237372514 \h </w:instrText>
+          <w:instrText xml:space="preserve"> PAGEREF _Toc238020617 \h </w:instrText>
         </w:r>
         <w:r>
           <w:rPr>
@@ -436,7 +445,7 @@
           <w:noProof/>
         </w:rPr>
       </w:pPr>
-      <w:hyperlink w:anchor="_Toc237372515" w:history="1">
+      <w:hyperlink w:anchor="_Toc238020618" w:history="1">
         <w:r>
           <w:rPr>
             <w:rStyle w:val="Hyperlink"/>
@@ -463,7 +472,7 @@
             <w:noProof/>
             <w:webHidden/>
           </w:rPr>
-          <w:instrText xml:space="preserve"> PAGEREF _Toc237372515 \h </w:instrText>
+          <w:instrText xml:space="preserve"> PAGEREF _Toc238020618 \h </w:instrText>
         </w:r>
         <w:r>
           <w:rPr>
@@ -483,7 +492,297 @@
             <w:noProof/>
             <w:webHidden/>
           </w:rPr>
+          <w:t>6</w:t>
+        </w:r>
+        <w:r>
+          <w:rPr>
+            <w:noProof/>
+            <w:webHidden/>
+          </w:rPr>
+          <w:fldChar w:fldCharType="end"/>
+        </w:r>
+      </w:hyperlink>
+    </w:p>
+    <w:p>
+      <w:pPr>
+        <w:pStyle w:val="TOC4"/>
+        <w:tabs>
+          <w:tab w:val="right" w:leader="dot" w:pos="9350"/>
+        </w:tabs>
+        <w:rPr>
+          <w:rFonts w:eastAsiaTheme="minorEastAsia"/>
+          <w:noProof/>
+        </w:rPr>
+      </w:pPr>
+      <w:hyperlink w:anchor="_Toc238020619" w:history="1">
+        <w:r>
+          <w:rPr>
+            <w:rStyle w:val="Hyperlink"/>
+            <w:noProof/>
+          </w:rPr>
+          <w:t>ACR Tasks</w:t>
+        </w:r>
+        <w:r>
+          <w:rPr>
+            <w:noProof/>
+            <w:webHidden/>
+          </w:rPr>
+          <w:tab/>
+        </w:r>
+        <w:r>
+          <w:rPr>
+            <w:noProof/>
+            <w:webHidden/>
+          </w:rPr>
+          <w:fldChar w:fldCharType="begin"/>
+        </w:r>
+        <w:r>
+          <w:rPr>
+            <w:noProof/>
+            <w:webHidden/>
+          </w:rPr>
+          <w:instrText xml:space="preserve"> PAGEREF _Toc238020619 \h </w:instrText>
+        </w:r>
+        <w:r>
+          <w:rPr>
+            <w:noProof/>
+            <w:webHidden/>
+          </w:rPr>
+        </w:r>
+        <w:r>
+          <w:rPr>
+            <w:noProof/>
+            <w:webHidden/>
+          </w:rPr>
+          <w:fldChar w:fldCharType="separate"/>
+        </w:r>
+        <w:r>
+          <w:rPr>
+            <w:noProof/>
+            <w:webHidden/>
+          </w:rPr>
           <w:t>7</w:t>
+        </w:r>
+        <w:r>
+          <w:rPr>
+            <w:noProof/>
+            <w:webHidden/>
+          </w:rPr>
+          <w:fldChar w:fldCharType="end"/>
+        </w:r>
+      </w:hyperlink>
+    </w:p>
+    <w:p>
+      <w:pPr>
+        <w:pStyle w:val="TOC4"/>
+        <w:tabs>
+          <w:tab w:val="right" w:leader="dot" w:pos="9350"/>
+        </w:tabs>
+        <w:rPr>
+          <w:rFonts w:eastAsiaTheme="minorEastAsia"/>
+          <w:noProof/>
+        </w:rPr>
+      </w:pPr>
+      <w:hyperlink w:anchor="_Toc238020620" w:history="1">
+        <w:r>
+          <w:rPr>
+            <w:rStyle w:val="Hyperlink"/>
+            <w:noProof/>
+          </w:rPr>
+          <w:t>Tagging strategies</w:t>
+        </w:r>
+        <w:r>
+          <w:rPr>
+            <w:noProof/>
+            <w:webHidden/>
+          </w:rPr>
+          <w:tab/>
+        </w:r>
+        <w:r>
+          <w:rPr>
+            <w:noProof/>
+            <w:webHidden/>
+          </w:rPr>
+          <w:fldChar w:fldCharType="begin"/>
+        </w:r>
+        <w:r>
+          <w:rPr>
+            <w:noProof/>
+            <w:webHidden/>
+          </w:rPr>
+          <w:instrText xml:space="preserve"> PAGEREF _Toc238020620 \h </w:instrText>
+        </w:r>
+        <w:r>
+          <w:rPr>
+            <w:noProof/>
+            <w:webHidden/>
+          </w:rPr>
+        </w:r>
+        <w:r>
+          <w:rPr>
+            <w:noProof/>
+            <w:webHidden/>
+          </w:rPr>
+          <w:fldChar w:fldCharType="separate"/>
+        </w:r>
+        <w:r>
+          <w:rPr>
+            <w:noProof/>
+            <w:webHidden/>
+          </w:rPr>
+          <w:t>10</w:t>
+        </w:r>
+        <w:r>
+          <w:rPr>
+            <w:noProof/>
+            <w:webHidden/>
+          </w:rPr>
+          <w:fldChar w:fldCharType="end"/>
+        </w:r>
+      </w:hyperlink>
+    </w:p>
+    <w:p>
+      <w:pPr>
+        <w:pStyle w:val="TOC4"/>
+        <w:tabs>
+          <w:tab w:val="right" w:leader="dot" w:pos="9350"/>
+        </w:tabs>
+        <w:rPr>
+          <w:rFonts w:eastAsiaTheme="minorEastAsia"/>
+          <w:noProof/>
+        </w:rPr>
+      </w:pPr>
+      <w:hyperlink w:anchor="_Toc238020621" w:history="1">
+        <w:r>
+          <w:rPr>
+            <w:rStyle w:val="Hyperlink"/>
+            <w:noProof/>
+          </w:rPr>
+          <w:t>Deploy containers to Azure App Services</w:t>
+        </w:r>
+        <w:r>
+          <w:rPr>
+            <w:noProof/>
+            <w:webHidden/>
+          </w:rPr>
+          <w:tab/>
+        </w:r>
+        <w:r>
+          <w:rPr>
+            <w:noProof/>
+            <w:webHidden/>
+          </w:rPr>
+          <w:fldChar w:fldCharType="begin"/>
+        </w:r>
+        <w:r>
+          <w:rPr>
+            <w:noProof/>
+            <w:webHidden/>
+          </w:rPr>
+          <w:instrText xml:space="preserve"> PAGEREF _Toc238020621 \h </w:instrText>
+        </w:r>
+        <w:r>
+          <w:rPr>
+            <w:noProof/>
+            <w:webHidden/>
+          </w:rPr>
+        </w:r>
+        <w:r>
+          <w:rPr>
+            <w:noProof/>
+            <w:webHidden/>
+          </w:rPr>
+          <w:fldChar w:fldCharType="separate"/>
+        </w:r>
+        <w:r>
+          <w:rPr>
+            <w:noProof/>
+            <w:webHidden/>
+          </w:rPr>
+          <w:t>13</w:t>
+        </w:r>
+        <w:r>
+          <w:rPr>
+            <w:noProof/>
+            <w:webHidden/>
+          </w:rPr>
+          <w:fldChar w:fldCharType="end"/>
+        </w:r>
+      </w:hyperlink>
+    </w:p>
+    <w:p>
+      <w:pPr>
+        <w:pStyle w:val="TOC4"/>
+        <w:tabs>
+          <w:tab w:val="right" w:leader="dot" w:pos="9350"/>
+        </w:tabs>
+        <w:rPr>
+          <w:rFonts w:eastAsiaTheme="minorEastAsia"/>
+          <w:noProof/>
+        </w:rPr>
+      </w:pPr>
+      <w:hyperlink w:anchor="_Toc238020622" w:history="1">
+        <w:r>
+          <w:rPr>
+            <w:rStyle w:val="Hyperlink"/>
+            <w:noProof/>
+          </w:rPr>
+          <w:t>Configure runtim</w:t>
+        </w:r>
+        <w:r>
+          <w:rPr>
+            <w:rStyle w:val="Hyperlink"/>
+            <w:noProof/>
+          </w:rPr>
+          <w:t>e</w:t>
+        </w:r>
+        <w:r>
+          <w:rPr>
+            <w:rStyle w:val="Hyperlink"/>
+            <w:noProof/>
+          </w:rPr>
+          <w:t xml:space="preserve"> behavior</w:t>
+        </w:r>
+        <w:r>
+          <w:rPr>
+            <w:noProof/>
+            <w:webHidden/>
+          </w:rPr>
+          <w:tab/>
+        </w:r>
+        <w:r>
+          <w:rPr>
+            <w:noProof/>
+            <w:webHidden/>
+          </w:rPr>
+          <w:fldChar w:fldCharType="begin"/>
+        </w:r>
+        <w:r>
+          <w:rPr>
+            <w:noProof/>
+            <w:webHidden/>
+          </w:rPr>
+          <w:instrText xml:space="preserve"> PAGEREF _Toc238020622 \h </w:instrText>
+        </w:r>
+        <w:r>
+          <w:rPr>
+            <w:noProof/>
+            <w:webHidden/>
+          </w:rPr>
+        </w:r>
+        <w:r>
+          <w:rPr>
+            <w:noProof/>
+            <w:webHidden/>
+          </w:rPr>
+          <w:fldChar w:fldCharType="separate"/>
+        </w:r>
+        <w:r>
+          <w:rPr>
+            <w:noProof/>
+            <w:webHidden/>
+          </w:rPr>
+          <w:t>15</w:t>
         </w:r>
         <w:r>
           <w:rPr>
@@ -605,7 +904,6 @@
         <w:pStyle w:val="Title"/>
       </w:pPr>
       <w:r>
-        <w:lastRenderedPageBreak/>
         <w:t>Azure AI Cloud Developer (AI-200)</w:t>
       </w:r>
     </w:p>
@@ -618,7 +916,7 @@
       <w:pPr>
         <w:pStyle w:val="Heading2"/>
       </w:pPr>
-      <w:bookmarkStart w:id="0" w:name="_Toc237372509"/>
+      <w:bookmarkStart w:id="0" w:name="_Toc238020612"/>
       <w:r>
         <w:rPr>
           <w:rStyle w:val="Heading1Char"/>
@@ -627,11 +925,11 @@
         </w:rPr>
         <w:t>Develop containerized solutions on Azure (20–25%)</w:t>
       </w:r>
-      <w:bookmarkEnd w:id="0"/>
       <w:r>
         <w:br/>
         <w:t>Implement container application hosting</w:t>
       </w:r>
+      <w:bookmarkEnd w:id="0"/>
     </w:p>
     <w:p>
       <w:r>
@@ -681,7 +979,7 @@
       <w:pPr>
         <w:pStyle w:val="Heading3"/>
       </w:pPr>
-      <w:bookmarkStart w:id="1" w:name="_Toc237372510"/>
+      <w:bookmarkStart w:id="1" w:name="_Toc238020613"/>
       <w:r>
         <w:t>Azure Container Registry (ACR)</w:t>
       </w:r>
@@ -705,7 +1003,7 @@
       <w:pPr>
         <w:pStyle w:val="Heading4"/>
       </w:pPr>
-      <w:bookmarkStart w:id="2" w:name="_Toc237372511"/>
+      <w:bookmarkStart w:id="2" w:name="_Toc238020614"/>
       <w:r>
         <w:t>Features</w:t>
       </w:r>
@@ -770,7 +1068,11 @@
         <w:t xml:space="preserve">Integration: </w:t>
       </w:r>
       <w:r>
-        <w:t>ACR provides seamless integration with other Azure related services such as Azure Kubernetes Services (AKS), Azure Container Apps (ACA) or Azure App Services (AAS). You can set up an end-to-end delivery pipeline from image definition and storing to image deployment.</w:t>
+        <w:t xml:space="preserve">ACR provides seamless integration with other Azure related services such as Azure Kubernetes Services (AKS), Azure Container Apps (ACA) or Azure App </w:t>
+      </w:r>
+      <w:r>
+        <w:lastRenderedPageBreak/>
+        <w:t>Services (AAS). You can set up an end-to-end delivery pipeline from image definition and storing to image deployment.</w:t>
       </w:r>
     </w:p>
     <w:p>
@@ -803,9 +1105,8 @@
       <w:pPr>
         <w:pStyle w:val="Heading4"/>
       </w:pPr>
-      <w:bookmarkStart w:id="3" w:name="_Toc237372512"/>
-      <w:r>
-        <w:lastRenderedPageBreak/>
+      <w:bookmarkStart w:id="3" w:name="_Toc238020615"/>
+      <w:r>
         <w:t>Tiers</w:t>
       </w:r>
       <w:bookmarkEnd w:id="3"/>
@@ -998,9 +1299,8 @@
       <w:pPr>
         <w:pStyle w:val="Heading4"/>
       </w:pPr>
-      <w:bookmarkStart w:id="4" w:name="_Toc237372513"/>
-      <w:r>
-        <w:lastRenderedPageBreak/>
+      <w:bookmarkStart w:id="4" w:name="_Toc238020616"/>
+      <w:r>
         <w:t>Registry hierarchy</w:t>
       </w:r>
       <w:bookmarkEnd w:id="4"/>
@@ -1125,6 +1425,7 @@
         <w:pStyle w:val="Heading5"/>
       </w:pPr>
       <w:r>
+        <w:lastRenderedPageBreak/>
         <w:t>Repository</w:t>
       </w:r>
     </w:p>
@@ -1138,11 +1439,7 @@
     </w:p>
     <w:p>
       <w:r>
-        <w:t xml:space="preserve">They also provide namespaces with the purpose of organizing the different artifacts and controlling access to them. For instance, you could create a ml-team namespace, a stage </w:t>
-      </w:r>
-      <w:r>
-        <w:lastRenderedPageBreak/>
-        <w:t>namespace and a production namespace and configure separate privileges and permissions for each of them.</w:t>
+        <w:t>They also provide namespaces with the purpose of organizing the different artifacts and controlling access to them. For instance, you could create a ml-team namespace, a stage namespace and a production namespace and configure separate privileges and permissions for each of them.</w:t>
       </w:r>
     </w:p>
     <w:p>
@@ -1201,10 +1498,7 @@
     </w:p>
     <w:p>
       <w:r>
-        <w:t>Each artifact has tags identifying it, layers that make up its content and a manifest describing its structure.</w:t>
-      </w:r>
-      <w:r>
-        <w:t xml:space="preserve"> We will address each of them separately:</w:t>
+        <w:t>Each artifact has tags identifying it, layers that make up its content and a manifest describing its structure. We will address each of them separately:</w:t>
       </w:r>
     </w:p>
     <w:p>
@@ -1415,6 +1709,7 @@
     </w:p>
     <w:p>
       <w:r>
+        <w:lastRenderedPageBreak/>
         <w:t>They are useful</w:t>
       </w:r>
       <w:r>
@@ -1426,7 +1721,6 @@
         <w:pStyle w:val="Heading6"/>
       </w:pPr>
       <w:r>
-        <w:lastRenderedPageBreak/>
         <w:t>Manifest</w:t>
       </w:r>
     </w:p>
@@ -1460,7 +1754,7 @@
       <w:pPr>
         <w:pStyle w:val="Heading4"/>
       </w:pPr>
-      <w:bookmarkStart w:id="6" w:name="_Toc237372514"/>
+      <w:bookmarkStart w:id="6" w:name="_Toc238020617"/>
       <w:r>
         <w:t>Artifacts addressing</w:t>
       </w:r>
@@ -1578,7 +1872,7 @@
       <w:pPr>
         <w:pStyle w:val="Heading4"/>
       </w:pPr>
-      <w:bookmarkStart w:id="7" w:name="_Toc237372515"/>
+      <w:bookmarkStart w:id="7" w:name="_Toc238020618"/>
       <w:r>
         <w:t>Best practices</w:t>
       </w:r>
@@ -1666,6 +1960,7 @@
           <w:b/>
           <w:bCs/>
         </w:rPr>
+        <w:lastRenderedPageBreak/>
         <w:t xml:space="preserve">Monitor storage: </w:t>
       </w:r>
       <w:r>
@@ -1677,10 +1972,11 @@
       <w:pPr>
         <w:pStyle w:val="Heading4"/>
       </w:pPr>
-      <w:r>
-        <w:lastRenderedPageBreak/>
+      <w:bookmarkStart w:id="8" w:name="_Toc238020619"/>
+      <w:r>
         <w:t>ACR Tasks</w:t>
       </w:r>
+      <w:bookmarkEnd w:id="8"/>
     </w:p>
     <w:p>
       <w:r>
@@ -1869,14 +2165,7 @@
           <w:i/>
           <w:iCs/>
         </w:rPr>
-        <w:t>az acr build --registry myregistry --image inference-api:v1.0.0</w:t>
-      </w:r>
-      <w:r>
-        <w:rPr>
-          <w:i/>
-          <w:iCs/>
-        </w:rPr>
-        <w:t xml:space="preserve"> </w:t>
+        <w:t xml:space="preserve">az acr build --registry myregistry --image inference-api:v1.0.0 </w:t>
       </w:r>
       <w:hyperlink r:id="rId7" w:history="1">
         <w:r>
@@ -1918,7 +2207,6 @@
         <w:pStyle w:val="Heading5"/>
       </w:pPr>
       <w:r>
-        <w:lastRenderedPageBreak/>
         <w:t>Automatically triggered tasks</w:t>
       </w:r>
     </w:p>
@@ -2160,7 +2448,6 @@
         <w:pStyle w:val="Heading5"/>
       </w:pPr>
       <w:r>
-        <w:lastRenderedPageBreak/>
         <w:t>Multi-steps tasks</w:t>
       </w:r>
     </w:p>
@@ -2423,6 +2710,7 @@
         </w:numPr>
       </w:pPr>
       <w:r>
+        <w:lastRenderedPageBreak/>
         <w:t>Check that required tools and frameworks are available</w:t>
       </w:r>
     </w:p>
@@ -2442,7 +2730,6 @@
         <w:pStyle w:val="Heading5"/>
       </w:pPr>
       <w:r>
-        <w:lastRenderedPageBreak/>
         <w:t>Best practices</w:t>
       </w:r>
     </w:p>
@@ -2536,7 +2823,2352 @@
         <w:t> ACR Tasks cache layers between builds. Order Dockerfile instructions to maximize cache hits by placing frequently changing instructions late in the file.</w:t>
       </w:r>
     </w:p>
+    <w:p>
+      <w:pPr>
+        <w:pStyle w:val="Heading4"/>
+      </w:pPr>
+      <w:bookmarkStart w:id="9" w:name="_Toc238020620"/>
+      <w:r>
+        <w:t>Tagging strategies</w:t>
+      </w:r>
+      <w:bookmarkEnd w:id="9"/>
+    </w:p>
+    <w:p>
+      <w:r>
+        <w:t>There are several approaches to tag the images you build:</w:t>
+      </w:r>
+    </w:p>
+    <w:p>
+      <w:pPr>
+        <w:pStyle w:val="Heading5"/>
+      </w:pPr>
+      <w:r>
+        <w:t>Stable tags</w:t>
+      </w:r>
+    </w:p>
+    <w:p>
+      <w:r>
+        <w:t xml:space="preserve">Consist of basically </w:t>
+      </w:r>
+      <w:r>
+        <w:t>classic</w:t>
+      </w:r>
+      <w:r>
+        <w:t xml:space="preserve"> tags such as </w:t>
+      </w:r>
+      <w:r>
+        <w:rPr>
+          <w:i/>
+          <w:iCs/>
+        </w:rPr>
+        <w:t xml:space="preserve">:v1.0.0 </w:t>
+      </w:r>
+      <w:r>
+        <w:t xml:space="preserve">or </w:t>
+      </w:r>
+      <w:r>
+        <w:rPr>
+          <w:i/>
+          <w:iCs/>
+        </w:rPr>
+        <w:t>:v2</w:t>
+      </w:r>
+      <w:r>
+        <w:rPr>
+          <w:i/>
+          <w:iCs/>
+        </w:rPr>
+        <w:t xml:space="preserve"> </w:t>
+      </w:r>
+      <w:r>
+        <w:t>reused across multiple image pushes</w:t>
+      </w:r>
+      <w:r>
+        <w:t>. They are human-readable with the tradeoff of being unpredictable, if someone pushes another image with the same tag the pointer will now point to the newer image over the previous one. This is well suited for development environments or base images receiving security updates.</w:t>
+      </w:r>
+    </w:p>
+    <w:p>
+      <w:pPr>
+        <w:pStyle w:val="Heading6"/>
+      </w:pPr>
+      <w:r>
+        <w:t>Semantic versioning</w:t>
+      </w:r>
+    </w:p>
+    <w:p>
+      <w:r>
+        <w:t xml:space="preserve">This is the default way of implementing stable tags strategy. You basically get this format: </w:t>
+      </w:r>
+      <w:r>
+        <w:rPr>
+          <w:i/>
+          <w:iCs/>
+        </w:rPr>
+        <w:t xml:space="preserve">MAJOR.MINOR.PATCH. </w:t>
+      </w:r>
+      <w:r>
+        <w:t xml:space="preserve">For example: </w:t>
+      </w:r>
+      <w:r>
+        <w:rPr>
+          <w:i/>
+          <w:iCs/>
+        </w:rPr>
+        <w:t>v.3.0.2</w:t>
+      </w:r>
+      <w:r>
+        <w:t>, where 3 is the MAJOR version, 0 is the MINOR and 2 is the PATCH.</w:t>
+      </w:r>
+    </w:p>
+    <w:p>
+      <w:r>
+        <w:t>When the MAJOR changes, it means there were some breaking changes in the product, so the MAJOR 3 might not to be compatible with MAJOR 2, for example.</w:t>
+      </w:r>
+    </w:p>
+    <w:p>
+      <w:r>
+        <w:t>When the MINOR changes, it means there were non-breaking changes, such as a new feature or endpoint.</w:t>
+      </w:r>
+    </w:p>
+    <w:p>
+      <w:r>
+        <w:lastRenderedPageBreak/>
+        <w:t>When the PATCH changes, it means there weren’t any new featured added, but things such as bugfixes or security patches that doesn’t changes the functionality of the product.</w:t>
+      </w:r>
+    </w:p>
+    <w:p>
+      <w:pPr>
+        <w:pStyle w:val="Heading5"/>
+      </w:pPr>
+      <w:r>
+        <w:t>Unique tags</w:t>
+      </w:r>
+    </w:p>
+    <w:p>
+      <w:r>
+        <w:t xml:space="preserve">They are unique tags such as </w:t>
+      </w:r>
+      <w:r>
+        <w:rPr>
+          <w:i/>
+          <w:iCs/>
+        </w:rPr>
+        <w:t>v1.2.0-build5384</w:t>
+      </w:r>
+      <w:r>
+        <w:t xml:space="preserve"> or </w:t>
+      </w:r>
+      <w:r>
+        <w:rPr>
+          <w:i/>
+          <w:iCs/>
+        </w:rPr>
+        <w:t>20260532-ahf354</w:t>
+      </w:r>
+      <w:r>
+        <w:t>, unlike stable tags they are never reused</w:t>
+      </w:r>
+      <w:r>
+        <w:t>, each image push creates a new tag, preserving all previous versions in the registry. They are well suited for production deployments, audit trails, rollbacks or compliance requirements with the trade-off that they might require updating deployment configurations when you release new versions, a potential advantage in production environments where you might want the changes to be intentional. Plus, as it preserves every tag version, none of them gets untagged, so it’s harder to remove them with commands such as remove untagged, potentially leading to higher storage consumption and costs.</w:t>
+      </w:r>
+    </w:p>
+    <w:p>
+      <w:pPr>
+        <w:pStyle w:val="Heading6"/>
+      </w:pPr>
+      <w:r>
+        <w:t>Build ID tags</w:t>
+      </w:r>
+    </w:p>
+    <w:p>
+      <w:pPr>
+        <w:rPr>
+          <w:i/>
+          <w:iCs/>
+        </w:rPr>
+      </w:pPr>
+      <w:r>
+        <w:t xml:space="preserve">You create the tag using the build ID generated from the pipeline run that’s producing the image. This could be helpful when investigating an issue or auditing the deployment since this approach connects the artifact with the logs, tests results and the pipeline that generated it. Example: </w:t>
+      </w:r>
+      <w:r>
+        <w:rPr>
+          <w:i/>
+          <w:iCs/>
+        </w:rPr>
+        <w:t>inference-api:build-4567</w:t>
+      </w:r>
+    </w:p>
+    <w:p>
+      <w:pPr>
+        <w:pStyle w:val="Heading6"/>
+      </w:pPr>
+      <w:r>
+        <w:t>Git commits SHA tags</w:t>
+      </w:r>
+    </w:p>
+    <w:p>
+      <w:pPr>
+        <w:rPr>
+          <w:i/>
+          <w:iCs/>
+        </w:rPr>
+      </w:pPr>
+      <w:r>
+        <w:t xml:space="preserve">You use the SHA generated from the commit as the tag for the image, this has the advantage of connecting directly the image with the commit version of the source code. Example: </w:t>
+      </w:r>
+      <w:r>
+        <w:rPr>
+          <w:i/>
+          <w:iCs/>
+        </w:rPr>
+        <w:t>inference-api:abc123f</w:t>
+      </w:r>
+    </w:p>
+    <w:p>
+      <w:pPr>
+        <w:pStyle w:val="Heading6"/>
+      </w:pPr>
+      <w:r>
+        <w:t>Timestamps</w:t>
+      </w:r>
+    </w:p>
+    <w:p>
+      <w:r>
+        <w:t xml:space="preserve">You use the timestamp when the image was generated, so you can quickly identify the exact date and hour when the image was built. Example: </w:t>
+      </w:r>
+      <w:r>
+        <w:rPr>
+          <w:i/>
+          <w:iCs/>
+        </w:rPr>
+        <w:t>inference-api20260520-140301</w:t>
+      </w:r>
+    </w:p>
+    <w:p>
+      <w:pPr>
+        <w:pStyle w:val="Heading6"/>
+      </w:pPr>
+      <w:r>
+        <w:t>Combined</w:t>
+      </w:r>
+    </w:p>
+    <w:p>
+      <w:pPr>
+        <w:rPr>
+          <w:i/>
+          <w:iCs/>
+        </w:rPr>
+      </w:pPr>
+      <w:r>
+        <w:t xml:space="preserve">You can use two or more of the approach mentioned before and get more context and the advantages of a combined approach from a single tag. Example: </w:t>
+      </w:r>
+      <w:r>
+        <w:rPr>
+          <w:i/>
+          <w:iCs/>
+        </w:rPr>
+        <w:t>inference-api:v1.2.0-build543h2-ab45h3</w:t>
+      </w:r>
+    </w:p>
+    <w:p>
+      <w:pPr>
+        <w:pStyle w:val="Heading5"/>
+      </w:pPr>
+      <w:r>
+        <w:t>Image locking</w:t>
+      </w:r>
+    </w:p>
+    <w:p>
+      <w:r>
+        <w:t>You can lock some operations from an image such as writing or deleting. So, not even an administrator could accidentally delete them. Locked images survive retention policies, so cleanups won’t remove them. This has an evident use case of locking production images. You can lock or unlock an image with a command like this:</w:t>
+      </w:r>
+    </w:p>
+    <w:p>
+      <w:pPr>
+        <w:rPr>
+          <w:i/>
+          <w:iCs/>
+        </w:rPr>
+      </w:pPr>
+      <w:r>
+        <w:rPr>
+          <w:i/>
+          <w:iCs/>
+        </w:rPr>
+        <w:lastRenderedPageBreak/>
+        <w:t>az acr repository update -</w:t>
+      </w:r>
+      <w:r>
+        <w:rPr>
+          <w:i/>
+          <w:iCs/>
+        </w:rPr>
+        <w:t>-name</w:t>
+      </w:r>
+      <w:r>
+        <w:rPr>
+          <w:i/>
+          <w:iCs/>
+        </w:rPr>
+        <w:t xml:space="preserve"> myregistry --</w:t>
+      </w:r>
+      <w:r>
+        <w:rPr>
+          <w:i/>
+          <w:iCs/>
+        </w:rPr>
+        <w:t>image</w:t>
+      </w:r>
+      <w:r>
+        <w:rPr>
+          <w:i/>
+          <w:iCs/>
+        </w:rPr>
+        <w:t xml:space="preserve"> inference-api:v1.2.0</w:t>
+      </w:r>
+      <w:r>
+        <w:rPr>
+          <w:i/>
+          <w:iCs/>
+        </w:rPr>
+        <w:t xml:space="preserve"> --</w:t>
+      </w:r>
+      <w:r>
+        <w:rPr>
+          <w:i/>
+          <w:iCs/>
+        </w:rPr>
+        <w:t>write-enabled [true|false}</w:t>
+      </w:r>
+    </w:p>
+    <w:p>
+      <w:pPr>
+        <w:rPr>
+          <w:i/>
+          <w:iCs/>
+        </w:rPr>
+      </w:pPr>
+    </w:p>
+    <w:p>
+      <w:pPr>
+        <w:pStyle w:val="Heading5"/>
+      </w:pPr>
+      <w:r>
+        <w:t>Image cleanup</w:t>
+      </w:r>
+    </w:p>
+    <w:p>
+      <w:r>
+        <w:t>You can get rid of untagged images by several methods:</w:t>
+      </w:r>
+    </w:p>
+    <w:p>
+      <w:pPr>
+        <w:pStyle w:val="Heading6"/>
+      </w:pPr>
+      <w:r>
+        <w:t>Single-time commands</w:t>
+      </w:r>
+    </w:p>
+    <w:p>
+      <w:r>
+        <w:t>This command purges untagged images when issued:</w:t>
+      </w:r>
+    </w:p>
+    <w:p>
+      <w:pPr>
+        <w:rPr>
+          <w:i/>
+          <w:iCs/>
+        </w:rPr>
+      </w:pPr>
+      <w:r>
+        <w:rPr>
+          <w:i/>
+          <w:iCs/>
+        </w:rPr>
+        <w:t>az acr run --registry myregistry --cmd “acr purge --filter ‘inference-api:.*’ --untagged --ago 30d” /dev/null</w:t>
+      </w:r>
+    </w:p>
+    <w:p>
+      <w:r>
+        <w:t>This command removes every untagged image older than 30 days at registry-level.</w:t>
+      </w:r>
+    </w:p>
+    <w:p>
+      <w:pPr>
+        <w:pStyle w:val="Heading6"/>
+      </w:pPr>
+      <w:r>
+        <w:t>Scheduled</w:t>
+      </w:r>
+    </w:p>
+    <w:p>
+      <w:r>
+        <w:t xml:space="preserve">You can </w:t>
+      </w:r>
+      <w:r>
+        <w:t xml:space="preserve">schedule </w:t>
+      </w:r>
+      <w:r>
+        <w:t xml:space="preserve">auto purge untagged </w:t>
+      </w:r>
+      <w:r>
+        <w:t>images by</w:t>
+      </w:r>
+      <w:r>
+        <w:t xml:space="preserve"> issuing this command:</w:t>
+      </w:r>
+    </w:p>
+    <w:p>
+      <w:pPr>
+        <w:rPr>
+          <w:i/>
+          <w:iCs/>
+        </w:rPr>
+      </w:pPr>
+      <w:r>
+        <w:rPr>
+          <w:i/>
+          <w:iCs/>
+        </w:rPr>
+        <w:t>az acr task create --registry myregistry --name cleanup-untagged --cmd “acr purge --filter ‘.*:.*’ –untagged --ago 7d” --schedule “0 0 * * 0” --context /dev/null/</w:t>
+      </w:r>
+    </w:p>
+    <w:p>
+      <w:r>
+        <w:t>This command runs weekly (</w:t>
+      </w:r>
+      <w:r>
+        <w:rPr>
+          <w:i/>
+          <w:iCs/>
+        </w:rPr>
+        <w:t>0 0 * * 0)</w:t>
+      </w:r>
+      <w:r>
+        <w:t xml:space="preserve"> and removes every untagged image older than seven days across all repositories in the registry.</w:t>
+      </w:r>
+    </w:p>
+    <w:p>
+      <w:pPr>
+        <w:pStyle w:val="Heading6"/>
+      </w:pPr>
+      <w:r>
+        <w:t>Retention policies</w:t>
+      </w:r>
+    </w:p>
+    <w:p>
+      <w:r>
+        <w:t>This is a feature available to Premium tier registries. Instead of managing tasks schedules and filters, you can set up a single retention policy that applies registry wide. These policies automatically clean up untagged manifests after a specified number of days.</w:t>
+      </w:r>
+    </w:p>
+    <w:p>
+      <w:pPr>
+        <w:pStyle w:val="Heading5"/>
+      </w:pPr>
+      <w:r>
+        <w:t>Best practices</w:t>
+      </w:r>
+    </w:p>
+    <w:p>
+      <w:r>
+        <w:t>Follow these practices to maintain a reliable container image strategy:</w:t>
+      </w:r>
+    </w:p>
+    <w:p>
+      <w:pPr>
+        <w:numPr>
+          <w:ilvl w:val="0"/>
+          <w:numId w:val="15"/>
+        </w:numPr>
+      </w:pPr>
+      <w:r>
+        <w:rPr>
+          <w:b/>
+          <w:bCs/>
+        </w:rPr>
+        <w:t>Use unique tags for production:</w:t>
+      </w:r>
+      <w:r>
+        <w:t> Guarantee consistency across all nodes in your deployment. Unique tags prevent surprises when images update.</w:t>
+      </w:r>
+    </w:p>
+    <w:p>
+      <w:pPr>
+        <w:numPr>
+          <w:ilvl w:val="0"/>
+          <w:numId w:val="15"/>
+        </w:numPr>
+      </w:pPr>
+      <w:r>
+        <w:rPr>
+          <w:b/>
+          <w:bCs/>
+        </w:rPr>
+        <w:t>Reserve stable tags for base images:</w:t>
+      </w:r>
+      <w:r>
+        <w:t> Allow security updates to flow automatically to dependent images through base image triggers.</w:t>
+      </w:r>
+    </w:p>
+    <w:p>
+      <w:pPr>
+        <w:numPr>
+          <w:ilvl w:val="0"/>
+          <w:numId w:val="15"/>
+        </w:numPr>
+      </w:pPr>
+      <w:r>
+        <w:rPr>
+          <w:b/>
+          <w:bCs/>
+        </w:rPr>
+        <w:t>Lock production images:</w:t>
+      </w:r>
+      <w:r>
+        <w:t> Prevent accidental deletion of images actively serving traffic. Unlock only when retiring versions.</w:t>
+      </w:r>
+    </w:p>
+    <w:p>
+      <w:pPr>
+        <w:numPr>
+          <w:ilvl w:val="0"/>
+          <w:numId w:val="15"/>
+        </w:numPr>
+      </w:pPr>
+      <w:r>
+        <w:rPr>
+          <w:b/>
+          <w:bCs/>
+        </w:rPr>
+        <w:t>Implement retention policies:</w:t>
+      </w:r>
+      <w:r>
+        <w:t> Clean up orphaned images to control storage costs. Schedule regular purge tasks.</w:t>
+      </w:r>
+    </w:p>
+    <w:p>
+      <w:pPr>
+        <w:numPr>
+          <w:ilvl w:val="0"/>
+          <w:numId w:val="15"/>
+        </w:numPr>
+      </w:pPr>
+      <w:r>
+        <w:rPr>
+          <w:b/>
+          <w:bCs/>
+        </w:rPr>
+        <w:lastRenderedPageBreak/>
+        <w:t>Include build metadata:</w:t>
+      </w:r>
+      <w:r>
+        <w:t> Add traceability information to tags for debugging and auditing. Link images to builds and source commits.</w:t>
+      </w:r>
+    </w:p>
+    <w:p>
+      <w:pPr>
+        <w:numPr>
+          <w:ilvl w:val="0"/>
+          <w:numId w:val="15"/>
+        </w:numPr>
+      </w:pPr>
+      <w:r>
+        <w:rPr>
+          <w:b/>
+          <w:bCs/>
+        </w:rPr>
+        <w:t>Document your tagging scheme:</w:t>
+      </w:r>
+      <w:r>
+        <w:t> Ensure your team follows consistent conventions. Document which tags are stable versus unique and when to use each.</w:t>
+      </w:r>
+    </w:p>
+    <w:p>
+      <w:pPr>
+        <w:pStyle w:val="Heading4"/>
+      </w:pPr>
+      <w:bookmarkStart w:id="10" w:name="_Toc238020621"/>
+      <w:r>
+        <w:t>Deploy containers to Azure App Services</w:t>
+      </w:r>
+      <w:bookmarkEnd w:id="10"/>
+    </w:p>
+    <w:p>
+      <w:r>
+        <w:t>When you create an App Service for Containers, you are allowed to select an image source that tells App Service where to pull your container image.</w:t>
+      </w:r>
+      <w:r>
+        <w:t xml:space="preserve"> It can be ACR or any registry</w:t>
+      </w:r>
+      <w:r>
+        <w:t xml:space="preserve"> accessible via HTTPS supporting Docker Registry HTTP API V2 specification such as Docker Hub, GitHub Container Registry or even self-container registries. For private images you provide the server URL, username and password. For public ones, only the name.</w:t>
+      </w:r>
+    </w:p>
+    <w:p>
+      <w:pPr>
+        <w:pStyle w:val="Heading5"/>
+      </w:pPr>
+      <w:r>
+        <w:t>ACR authentication options</w:t>
+      </w:r>
+    </w:p>
+    <w:p>
+      <w:r>
+        <w:t>We have two main authentication options when deploying to App Service:</w:t>
+      </w:r>
+    </w:p>
+    <w:p>
+      <w:pPr>
+        <w:pStyle w:val="Heading6"/>
+      </w:pPr>
+      <w:r>
+        <w:t>Managed Identity</w:t>
+      </w:r>
+    </w:p>
+    <w:p>
+      <w:r>
+        <w:t>This is the recommended approach for production. App Service authenticates to ACR using Azure Identity rather than stored credentials, eliminating credential rotation concerns, providing better security and auditing. We have two different kinds of managed identity:</w:t>
+      </w:r>
+    </w:p>
+    <w:p>
+      <w:pPr>
+        <w:pStyle w:val="Heading7"/>
+      </w:pPr>
+      <w:r>
+        <w:t>System-assigned managed identity</w:t>
+      </w:r>
+    </w:p>
+    <w:p>
+      <w:r>
+        <w:t>This is tied to the web app lifecycle. Azure creates the identity on the creation of the web app and deletes it on the deletion of the web app. This option is simpler when the web app is the only resource needed for identity.</w:t>
+      </w:r>
+    </w:p>
+    <w:p>
+      <w:pPr>
+        <w:pStyle w:val="Heading7"/>
+      </w:pPr>
+      <w:r>
+        <w:t>User-assigned managed identity</w:t>
+      </w:r>
+    </w:p>
+    <w:p>
+      <w:r>
+        <w:t>Exists independently of the web app. You create the identity as a separated Azure resource and assign it to one or more web apps. This option is recommended when you have several apps requiring identity or when you want configure permissions before the creation of the web app.</w:t>
+      </w:r>
+    </w:p>
+    <w:p>
+      <w:pPr>
+        <w:pStyle w:val="Heading6"/>
+      </w:pPr>
+      <w:r>
+        <w:t>Admin credentials authentication</w:t>
+      </w:r>
+    </w:p>
+    <w:p>
+      <w:r>
+        <w:t>They use a username and password stored in ACR. This approach is simpler for development scenarios because it doesn’t require role assignments. However, requires manual credential rotation if compromised. To use admin credentials, issue this command so you enable the admin user on your registry:</w:t>
+      </w:r>
+    </w:p>
+    <w:p>
+      <w:pPr>
+        <w:rPr>
+          <w:i/>
+          <w:iCs/>
+        </w:rPr>
+      </w:pPr>
+      <w:r>
+        <w:rPr>
+          <w:i/>
+          <w:iCs/>
+        </w:rPr>
+        <w:t>az acr update --name myregistry --admin-enabled true</w:t>
+      </w:r>
+    </w:p>
+    <w:p>
+      <w:pPr>
+        <w:pStyle w:val="Heading5"/>
+      </w:pPr>
+      <w:r>
+        <w:lastRenderedPageBreak/>
+        <w:t>Deploy to App Services using Azure CLI</w:t>
+      </w:r>
+    </w:p>
+    <w:p>
+      <w:r>
+        <w:t>You can deploy a container to App Service from the command line when you want a repeatable workflow that you can paste into a script or CI pipeline. This section assumes your container image already exists in Azure Container Registry and that App Service already has permission to pull it. In practice, that permission is often provided through managed identity and an AcrPull role assignment applied by a platform team.</w:t>
+      </w:r>
+      <w:r>
+        <w:t xml:space="preserve"> These are the steps:</w:t>
+      </w:r>
+    </w:p>
+    <w:p>
+      <w:pPr>
+        <w:pStyle w:val="ListParagraph"/>
+        <w:numPr>
+          <w:ilvl w:val="1"/>
+          <w:numId w:val="13"/>
+        </w:numPr>
+        <w:rPr>
+          <w:i/>
+          <w:iCs/>
+        </w:rPr>
+      </w:pPr>
+      <w:r>
+        <w:t xml:space="preserve">Create the app service and set the container image in one step: </w:t>
+      </w:r>
+      <w:r>
+        <w:rPr>
+          <w:i/>
+          <w:iCs/>
+        </w:rPr>
+        <w:t xml:space="preserve">az resource create --resourceGroup myResourceGroup --plan myAppServicePlan --name myDocumentProcessor --container-image-name </w:t>
+      </w:r>
+      <w:r>
+        <w:rPr>
+          <w:i/>
+          <w:iCs/>
+        </w:rPr>
+        <w:t>myregistry.azurecr.io/docprocessor:v1</w:t>
+      </w:r>
+      <w:r>
+        <w:rPr>
+          <w:i/>
+          <w:iCs/>
+        </w:rPr>
+        <w:t xml:space="preserve"> [</w:t>
+      </w:r>
+      <w:r>
+        <w:rPr>
+          <w:i/>
+          <w:iCs/>
+        </w:rPr>
+        <w:t xml:space="preserve">--docker-registry-server-url </w:t>
+      </w:r>
+      <w:hyperlink r:id="rId9" w:history="1">
+        <w:r>
+          <w:rPr>
+            <w:rStyle w:val="Hyperlink"/>
+            <w:i/>
+            <w:iCs/>
+          </w:rPr>
+          <w:t>https://index.docker.io/v1/</w:t>
+        </w:r>
+      </w:hyperlink>
+      <w:r>
+        <w:rPr>
+          <w:i/>
+          <w:iCs/>
+        </w:rPr>
+        <w:t>] [</w:t>
+      </w:r>
+      <w:r>
+        <w:rPr>
+          <w:i/>
+          <w:iCs/>
+        </w:rPr>
+        <w:t xml:space="preserve">--docker-registry-server-user myusername </w:t>
+      </w:r>
+    </w:p>
+    <w:p>
+      <w:pPr>
+        <w:pStyle w:val="ListParagraph"/>
+        <w:ind w:left="1440"/>
+        <w:rPr>
+          <w:i/>
+          <w:iCs/>
+        </w:rPr>
+      </w:pPr>
+      <w:r>
+        <w:rPr>
+          <w:i/>
+          <w:iCs/>
+        </w:rPr>
+        <w:t>--docker-registry-server-password &lt;password&gt;</w:t>
+      </w:r>
+      <w:r>
+        <w:rPr>
+          <w:i/>
+          <w:iCs/>
+        </w:rPr>
+        <w:t>]</w:t>
+      </w:r>
+    </w:p>
+    <w:p>
+      <w:pPr>
+        <w:pStyle w:val="ListParagraph"/>
+        <w:ind w:left="1440"/>
+        <w:rPr>
+          <w:i/>
+          <w:iCs/>
+        </w:rPr>
+      </w:pPr>
+    </w:p>
+    <w:p>
+      <w:pPr>
+        <w:pStyle w:val="ListParagraph"/>
+        <w:ind w:left="1440"/>
+      </w:pPr>
+      <w:r>
+        <w:t>You can use registries other than ACR by specifying the</w:t>
+      </w:r>
+      <w:r>
+        <w:rPr>
+          <w:i/>
+          <w:iCs/>
+        </w:rPr>
+        <w:t xml:space="preserve"> --docker-registry-server-url </w:t>
+      </w:r>
+      <w:r>
+        <w:t>command</w:t>
+      </w:r>
+      <w:r>
+        <w:t xml:space="preserve"> and, if the registry is private, you will be required to also specify the </w:t>
+      </w:r>
+      <w:r>
+        <w:rPr>
+          <w:i/>
+          <w:iCs/>
+        </w:rPr>
+        <w:t xml:space="preserve">--docker-registry-server-user </w:t>
+      </w:r>
+      <w:r>
+        <w:t xml:space="preserve">and the </w:t>
+      </w:r>
+      <w:r>
+        <w:rPr>
+          <w:i/>
+          <w:iCs/>
+        </w:rPr>
+        <w:t>--docker-registry-server-password</w:t>
+      </w:r>
+      <w:r>
+        <w:t xml:space="preserve"> parameters.</w:t>
+      </w:r>
+    </w:p>
+    <w:p>
+      <w:pPr>
+        <w:pStyle w:val="ListParagraph"/>
+        <w:ind w:left="1440"/>
+      </w:pPr>
+    </w:p>
+    <w:p>
+      <w:pPr>
+        <w:pStyle w:val="ListParagraph"/>
+        <w:ind w:left="1440"/>
+      </w:pPr>
+      <w:r>
+        <w:t>For this command to work, the resource group and the App Service Plan need to be previously created.</w:t>
+      </w:r>
+    </w:p>
+    <w:p>
+      <w:pPr>
+        <w:pStyle w:val="Heading6"/>
+      </w:pPr>
+      <w:r>
+        <w:t>Update the container image used by App Services</w:t>
+      </w:r>
+    </w:p>
+    <w:p>
+      <w:r>
+        <w:t>You can release a new version of the image by updating the tag, the App Service will restart the web app and pull the new image to each instance automatically. Issue this command:</w:t>
+      </w:r>
+    </w:p>
+    <w:p>
+      <w:pPr>
+        <w:rPr>
+          <w:i/>
+          <w:iCs/>
+        </w:rPr>
+      </w:pPr>
+      <w:r>
+        <w:rPr>
+          <w:i/>
+          <w:iCs/>
+        </w:rPr>
+        <w:t xml:space="preserve">az webapp config container set --resource-group myResourceGroup --name myDocumentProcessor --container-image-name </w:t>
+      </w:r>
+      <w:r>
+        <w:rPr>
+          <w:i/>
+          <w:iCs/>
+        </w:rPr>
+        <w:t>myregistry.azurecr.io/docprocessor:v2</w:t>
+      </w:r>
+    </w:p>
+    <w:p>
+      <w:r>
+        <w:t xml:space="preserve">Note that the tag must be different than the currently deployed to App Service, so, if the new image is </w:t>
+      </w:r>
+      <w:r>
+        <w:rPr>
+          <w:i/>
+          <w:iCs/>
+        </w:rPr>
+        <w:t>inference-api:v2.0.0</w:t>
+      </w:r>
+      <w:r>
+        <w:t xml:space="preserve"> and the new version is also tagged as </w:t>
+      </w:r>
+      <w:r>
+        <w:rPr>
+          <w:i/>
+          <w:iCs/>
+        </w:rPr>
+        <w:t>inference-api:v2.0.0</w:t>
+      </w:r>
+      <w:r>
+        <w:t xml:space="preserve"> App Services won’t be able to detect the change and you will have to proceed manually.</w:t>
+      </w:r>
+    </w:p>
+    <w:p>
+      <w:pPr>
+        <w:pStyle w:val="Heading6"/>
+      </w:pPr>
+      <w:r>
+        <w:t>Enable continuous deployment</w:t>
+      </w:r>
+    </w:p>
+    <w:p>
+      <w:r>
+        <w:t>You can set up automated deployments, so when you push new images to ACR they will be pulled by App Service. This approach works well for CI/CD pipelines. Issue this command:</w:t>
+      </w:r>
+    </w:p>
+    <w:p>
+      <w:pPr>
+        <w:rPr>
+          <w:i/>
+          <w:iCs/>
+        </w:rPr>
+      </w:pPr>
+      <w:r>
+        <w:rPr>
+          <w:i/>
+          <w:iCs/>
+        </w:rPr>
+        <w:t>az webapp deployment container config --resource-group myResourceGroup --name myDocumentProcessor --enable-cd true</w:t>
+      </w:r>
+    </w:p>
+    <w:p>
+      <w:r>
+        <w:lastRenderedPageBreak/>
+        <w:t xml:space="preserve">This command returns a webhook URL, so you can configure your ACR to execute it on image pushes. So, create in ACR a webhook in the registry settings that triggers on push events. </w:t>
+      </w:r>
+    </w:p>
     <w:p/>
+    <w:p/>
+    <w:p>
+      <w:pPr>
+        <w:pStyle w:val="Heading6"/>
+      </w:pPr>
+      <w:r>
+        <w:t>Verify the deployment</w:t>
+      </w:r>
+    </w:p>
+    <w:p>
+      <w:r>
+        <w:t>You can verify deployment status issuing this command:</w:t>
+      </w:r>
+    </w:p>
+    <w:p>
+      <w:pPr>
+        <w:rPr>
+          <w:i/>
+          <w:iCs/>
+        </w:rPr>
+      </w:pPr>
+      <w:r>
+        <w:rPr>
+          <w:i/>
+          <w:iCs/>
+        </w:rPr>
+        <w:t>az webapp  show --resource-group myResourceGroup --name myDocumentProcessor --query defaultHostName --output tsv</w:t>
+      </w:r>
+    </w:p>
+    <w:p>
+      <w:r>
+        <w:t>This returns the URL to the App Service, so you can check if the application responds.</w:t>
+      </w:r>
+    </w:p>
+    <w:p>
+      <w:pPr>
+        <w:pStyle w:val="Heading6"/>
+      </w:pPr>
+      <w:r>
+        <w:t>Image pull behavior</w:t>
+      </w:r>
+    </w:p>
+    <w:p>
+      <w:r>
+        <w:t>Understanding when App Service pulls images helps you plan for deployment scenarios and troubleshoot issues.</w:t>
+      </w:r>
+    </w:p>
+    <w:p>
+      <w:pPr>
+        <w:numPr>
+          <w:ilvl w:val="0"/>
+          <w:numId w:val="16"/>
+        </w:numPr>
+      </w:pPr>
+      <w:r>
+        <w:rPr>
+          <w:b/>
+          <w:bCs/>
+        </w:rPr>
+        <w:t>Initial deployment:</w:t>
+      </w:r>
+      <w:r>
+        <w:t> App Service pulls all image layers when you first deploy the container or change the image reference.</w:t>
+      </w:r>
+    </w:p>
+    <w:p>
+      <w:pPr>
+        <w:numPr>
+          <w:ilvl w:val="0"/>
+          <w:numId w:val="16"/>
+        </w:numPr>
+      </w:pPr>
+      <w:r>
+        <w:rPr>
+          <w:b/>
+          <w:bCs/>
+        </w:rPr>
+        <w:t>App restart:</w:t>
+      </w:r>
+      <w:r>
+        <w:t> On restart, App Service checks for changes and pulls only modified layers. If the image is unchanged, the cached layers are used.</w:t>
+      </w:r>
+    </w:p>
+    <w:p>
+      <w:pPr>
+        <w:numPr>
+          <w:ilvl w:val="0"/>
+          <w:numId w:val="16"/>
+        </w:numPr>
+      </w:pPr>
+      <w:r>
+        <w:rPr>
+          <w:b/>
+          <w:bCs/>
+        </w:rPr>
+        <w:t>Scale out:</w:t>
+      </w:r>
+      <w:r>
+        <w:t> When App Service adds new instances, each instance pulls the image. New instances might need to pull the full image if layers aren't cached on the underlying infrastructure.</w:t>
+      </w:r>
+    </w:p>
+    <w:p>
+      <w:pPr>
+        <w:numPr>
+          <w:ilvl w:val="0"/>
+          <w:numId w:val="16"/>
+        </w:numPr>
+      </w:pPr>
+      <w:r>
+        <w:rPr>
+          <w:b/>
+          <w:bCs/>
+        </w:rPr>
+        <w:t>Pricing tier changes:</w:t>
+      </w:r>
+      <w:r>
+        <w:t> Moving to a different pricing tier might allocate new infrastructure, which pulls the image fresh and can affect startup time.</w:t>
+      </w:r>
+    </w:p>
+    <w:p>
+      <w:pPr>
+        <w:pStyle w:val="Heading4"/>
+      </w:pPr>
+      <w:bookmarkStart w:id="11" w:name="_Toc238020622"/>
+      <w:r>
+        <w:t>Configure runtime behavior</w:t>
+      </w:r>
+      <w:bookmarkEnd w:id="11"/>
+    </w:p>
+    <w:p>
+      <w:r>
+        <w:t>Container runtime settings control how App Service executes your container. These settings affect container startup, network configuration, file system behavior, and health monitoring. Configuring these settings correctly ensures your application starts reliably and performs well under load.</w:t>
+      </w:r>
+    </w:p>
+    <w:p>
+      <w:pPr>
+        <w:pStyle w:val="Heading5"/>
+      </w:pPr>
+      <w:r>
+        <w:t>Startup commands</w:t>
+      </w:r>
+    </w:p>
+    <w:p>
+      <w:r>
+        <w:t xml:space="preserve">App Service runs containers using the entrypoint and command defined in the Dockerfile. You can override the startup with a custom </w:t>
+      </w:r>
+      <w:r>
+        <w:t>startup when</w:t>
+      </w:r>
+      <w:r>
+        <w:t xml:space="preserve"> you need to pass runtime arguments, run initialization scripts or database migrations, starting multiple processes within the container or modify the container’s behavior.</w:t>
+      </w:r>
+    </w:p>
+    <w:p>
+      <w:r>
+        <w:lastRenderedPageBreak/>
+        <w:t>You can configure startup commands issuing this command in Azure CLI:</w:t>
+      </w:r>
+    </w:p>
+    <w:p>
+      <w:pPr>
+        <w:rPr>
+          <w:i/>
+          <w:iCs/>
+        </w:rPr>
+      </w:pPr>
+      <w:r>
+        <w:rPr>
+          <w:i/>
+          <w:iCs/>
+        </w:rPr>
+        <w:t>az webapp config set --resource-group myResourceGroup --name myDocumentProcessor --startup-file "gunicorn --bind=0.0.0.0:8000 --workers=4 app:application"</w:t>
+      </w:r>
+    </w:p>
+    <w:p>
+      <w:r>
+        <w:t>The startup command replaces the CMD instruction from your Dockerfile and it remains unchanged unless you modify the container configuration directly.</w:t>
+      </w:r>
+    </w:p>
+    <w:p>
+      <w:pPr>
+        <w:pStyle w:val="Heading5"/>
+      </w:pPr>
+      <w:r>
+        <w:t>Port configuration</w:t>
+      </w:r>
+    </w:p>
+    <w:p>
+      <w:r>
+        <w:t xml:space="preserve">When your web application </w:t>
+      </w:r>
+      <w:r>
+        <w:t>listens to</w:t>
+      </w:r>
+      <w:r>
+        <w:t xml:space="preserve"> HTTP requests in a </w:t>
+      </w:r>
+      <w:r>
+        <w:t xml:space="preserve">port other than 80 or 8080 you must redirect the traffic to the port your container is listening to. Let’s say the web application is listening in port 8000. You would need to issue this command, so App Service </w:t>
+      </w:r>
+      <w:r>
+        <w:t>can</w:t>
+      </w:r>
+      <w:r>
+        <w:t xml:space="preserve"> forward the request to the correct port:</w:t>
+      </w:r>
+    </w:p>
+    <w:p>
+      <w:pPr>
+        <w:rPr>
+          <w:i/>
+          <w:iCs/>
+        </w:rPr>
+      </w:pPr>
+      <w:r>
+        <w:rPr>
+          <w:i/>
+          <w:iCs/>
+        </w:rPr>
+        <w:t>az webapp config appsettings set --resource-group myResourceGroup --name myDocumentProcessor --settings WEBSITES_PORT=8000</w:t>
+      </w:r>
+    </w:p>
+    <w:p>
+      <w:r>
+        <w:t xml:space="preserve">Only </w:t>
+      </w:r>
+      <w:r>
+        <w:t>one port for HTTP request can be exposed to a custom container.</w:t>
+      </w:r>
+    </w:p>
+    <w:p>
+      <w:pPr>
+        <w:pStyle w:val="Heading5"/>
+      </w:pPr>
+      <w:r>
+        <w:t>Persistent storage</w:t>
+      </w:r>
+    </w:p>
+    <w:p>
+      <w:r>
+        <w:t>By default, the file system in App Service is ephemeral, so when the instance is restarted or moves to different infrastructure any change in the file system (files writings, changes, and so on) will be gone.</w:t>
+      </w:r>
+    </w:p>
+    <w:p>
+      <w:r>
+        <w:t xml:space="preserve">To </w:t>
+      </w:r>
+      <w:r>
+        <w:t>use</w:t>
+      </w:r>
+      <w:r>
+        <w:t xml:space="preserve"> persistent storage in the file system of the App Service’s Linux custom containers you will need to enable this </w:t>
+      </w:r>
+      <w:r>
+        <w:t>feature by issuing this command:</w:t>
+      </w:r>
+    </w:p>
+    <w:p>
+      <w:pPr>
+        <w:rPr>
+          <w:i/>
+          <w:iCs/>
+        </w:rPr>
+      </w:pPr>
+      <w:r>
+        <w:rPr>
+          <w:i/>
+          <w:iCs/>
+        </w:rPr>
+        <w:t>az webapp config appsettings set --resource-group myResourceGroup --name myDocumentProcessor --settings WEBSITES_ENABLE_APP_SERVICE_STORAGE=true</w:t>
+      </w:r>
+    </w:p>
+    <w:p>
+      <w:r>
+        <w:t xml:space="preserve">Setting the </w:t>
+      </w:r>
+      <w:r>
+        <w:rPr>
+          <w:i/>
+          <w:iCs/>
+        </w:rPr>
+        <w:t>WEBSITES_ENABLE_APP_SERVICE_</w:t>
+      </w:r>
+      <w:r>
+        <w:t>STORAGE</w:t>
+      </w:r>
+      <w:r>
+        <w:t xml:space="preserve"> to </w:t>
+      </w:r>
+      <w:r>
+        <w:rPr>
+          <w:i/>
+          <w:iCs/>
+        </w:rPr>
+        <w:t>true</w:t>
+      </w:r>
+      <w:r>
+        <w:t>,</w:t>
+      </w:r>
+      <w:r>
+        <w:t xml:space="preserve"> the </w:t>
+      </w:r>
+      <w:r>
+        <w:rPr>
+          <w:i/>
+          <w:iCs/>
+        </w:rPr>
+        <w:t>/home</w:t>
+      </w:r>
+      <w:r>
+        <w:t xml:space="preserve"> directory </w:t>
+      </w:r>
+      <w:r>
+        <w:t xml:space="preserve">(and subdirectories) </w:t>
+      </w:r>
+      <w:r>
+        <w:t>survives restarts and changes across infrastructure and it’s shared across all the instances of a scaled-out app.</w:t>
+      </w:r>
+      <w:r>
+        <w:t xml:space="preserve"> </w:t>
+      </w:r>
+      <w:r>
+        <w:t>The </w:t>
+      </w:r>
+      <w:r>
+        <w:rPr>
+          <w:i/>
+          <w:iCs/>
+        </w:rPr>
+        <w:t>/home/LogFiles</w:t>
+      </w:r>
+      <w:r>
+        <w:t> directory stores container and application logs</w:t>
+      </w:r>
+      <w:r>
+        <w:t>.</w:t>
+      </w:r>
+    </w:p>
+    <w:p>
+      <w:r>
+        <w:t>Storage capacity depends on your App Service plan. The storage quota is shared across all apps in the plan. For applications requiring large storage volumes or high I/O performance, consider mounting Azure Storage as an extra volume.</w:t>
+      </w:r>
+    </w:p>
+    <w:p>
+      <w:pPr>
+        <w:pStyle w:val="Heading5"/>
+      </w:pPr>
+      <w:r>
+        <w:t>Always-on</w:t>
+      </w:r>
+    </w:p>
+    <w:p>
+      <w:r>
+        <w:t xml:space="preserve">App Service instances become idle after 20 minutes of inactivity. The next request triggers a cold start, meaning App Service has to start the instance again, wait for it to be ready (it </w:t>
+      </w:r>
+      <w:r>
+        <w:lastRenderedPageBreak/>
+        <w:t xml:space="preserve">can take seconds or minutes depending on several factors such as image size, dependency initialization or application startup time) and only then process user’s request. </w:t>
+      </w:r>
+    </w:p>
+    <w:p>
+      <w:r>
+        <w:t>In production and services that maintain background processes and connection you might want to get rid of cold starts. You can achieve it by issuing this command:</w:t>
+      </w:r>
+    </w:p>
+    <w:p>
+      <w:r>
+        <w:rPr>
+          <w:i/>
+          <w:iCs/>
+        </w:rPr>
+        <w:t>az webapp config set --resource-group myResourceGroup --name myDocumentProcessor --always-on true</w:t>
+      </w:r>
+    </w:p>
+    <w:p>
+      <w:r>
+        <w:t xml:space="preserve">By setting the </w:t>
+      </w:r>
+      <w:r>
+        <w:rPr>
+          <w:i/>
+          <w:iCs/>
+        </w:rPr>
+        <w:t>–always-on</w:t>
+      </w:r>
+      <w:r>
+        <w:t xml:space="preserve"> argument to </w:t>
+      </w:r>
+      <w:r>
+        <w:rPr>
+          <w:i/>
+          <w:iCs/>
+        </w:rPr>
+        <w:t>true</w:t>
+      </w:r>
+      <w:r>
+        <w:t>, App Service will send periodic requests to the instance to keep it warm and preventing cold starts.</w:t>
+      </w:r>
+    </w:p>
+    <w:p>
+      <w:pPr>
+        <w:pStyle w:val="Heading5"/>
+      </w:pPr>
+      <w:r>
+        <w:t>Health checks</w:t>
+      </w:r>
+    </w:p>
+    <w:p>
+      <w:r>
+        <w:t>This feature monitor container’s responsiveness and automatically restarts unhealthy instances. App Service achieves this by sending a predefined request to a specified path and evaluates the response to determine container’s health. You can set this up by issuing this command:</w:t>
+      </w:r>
+    </w:p>
+    <w:p>
+      <w:pPr>
+        <w:rPr>
+          <w:i/>
+          <w:iCs/>
+        </w:rPr>
+      </w:pPr>
+      <w:r>
+        <w:rPr>
+          <w:i/>
+          <w:iCs/>
+        </w:rPr>
+        <w:t>az webapp config set --resource-group myResourceGroup --name myDocumentProcessor --generic-configurations '{"healthCheckPath": "/health"}'</w:t>
+      </w:r>
+    </w:p>
+    <w:p>
+      <w:r>
+        <w:t xml:space="preserve">By setting the </w:t>
+      </w:r>
+      <w:r>
+        <w:rPr>
+          <w:i/>
+          <w:iCs/>
+        </w:rPr>
+        <w:t>--generic-configurations</w:t>
+      </w:r>
+      <w:r>
+        <w:t xml:space="preserve"> argument to </w:t>
+      </w:r>
+      <w:r>
+        <w:rPr>
+          <w:i/>
+          <w:iCs/>
+        </w:rPr>
+        <w:t>‘{“healthCheckPath”: “/health”}’</w:t>
+      </w:r>
+      <w:r>
+        <w:t xml:space="preserve"> you’re configuring App Service to send health check request to the </w:t>
+      </w:r>
+      <w:r>
+        <w:rPr>
+          <w:i/>
+          <w:iCs/>
+        </w:rPr>
+        <w:t>/health</w:t>
+      </w:r>
+      <w:r>
+        <w:t xml:space="preserve"> endpoint</w:t>
+      </w:r>
+      <w:r>
+        <w:t xml:space="preserve"> every minute, if an instance repeteadly files (by default, after 10 failed pings), App Services will remove it from the load balancer rotation.</w:t>
+      </w:r>
+    </w:p>
+    <w:p>
+      <w:r>
+        <w:t>Health check configuration changes restart your app, so, use it carefully in production.</w:t>
+      </w:r>
+    </w:p>
+    <w:p>
+      <w:pPr>
+        <w:pStyle w:val="Heading4"/>
+      </w:pPr>
+      <w:r>
+        <w:t>Configure application settings</w:t>
+      </w:r>
+    </w:p>
+    <w:p>
+      <w:r>
+        <w:t>Application settings provide configuration values to your containerized application at runtime, App Services injects those values as environment variables instead of harcoded values, allowing you to deploy the same container image across different environments with environment-specific configuration.</w:t>
+      </w:r>
+    </w:p>
+    <w:p>
+      <w:pPr>
+        <w:pStyle w:val="Heading5"/>
+      </w:pPr>
+      <w:r>
+        <w:t>App settings</w:t>
+      </w:r>
+    </w:p>
+    <w:p>
+      <w:r>
+        <w:t>App settings are basically key-value pairs</w:t>
+      </w:r>
+      <w:r>
+        <w:t xml:space="preserve"> </w:t>
+      </w:r>
+      <w:r>
+        <w:t>that App Services injects as environment variables using the standard mechanisms of your chosen programming language</w:t>
+      </w:r>
+      <w:r>
+        <w:t>. You can create or update app settings using this command:</w:t>
+      </w:r>
+    </w:p>
+    <w:p>
+      <w:r>
+        <w:rPr>
+          <w:i/>
+          <w:iCs/>
+        </w:rPr>
+        <w:t>az webapp config appsettings set --resource-group myResourceGroup --name myDocumentProcessor --settings STORAGE_ACCOUNT_NAME=mystorageaccount LOG_LEVEL=INFO MAX_DOCUMENT_SIZE_MB=50</w:t>
+      </w:r>
+    </w:p>
+    <w:p>
+      <w:r>
+        <w:lastRenderedPageBreak/>
+        <w:t xml:space="preserve">By issuing this command, your </w:t>
+      </w:r>
+      <w:r>
+        <w:t>application conceptually does something like this:</w:t>
+      </w:r>
+    </w:p>
+    <w:p>
+      <w:pPr>
+        <w:rPr>
+          <w:i/>
+          <w:iCs/>
+        </w:rPr>
+      </w:pPr>
+      <w:r>
+        <w:rPr>
+          <w:i/>
+          <w:iCs/>
+        </w:rPr>
+        <w:t>import os</w:t>
+      </w:r>
+    </w:p>
+    <w:p>
+      <w:pPr>
+        <w:rPr>
+          <w:i/>
+          <w:iCs/>
+        </w:rPr>
+      </w:pPr>
+    </w:p>
+    <w:p>
+      <w:pPr>
+        <w:rPr>
+          <w:i/>
+          <w:iCs/>
+        </w:rPr>
+      </w:pPr>
+      <w:r>
+        <w:rPr>
+          <w:i/>
+          <w:iCs/>
+        </w:rPr>
+        <w:t>storage_account = os.environ.get('STORAGE_ACCOUNT_NAME')</w:t>
+      </w:r>
+    </w:p>
+    <w:p>
+      <w:pPr>
+        <w:rPr>
+          <w:i/>
+          <w:iCs/>
+        </w:rPr>
+      </w:pPr>
+      <w:r>
+        <w:rPr>
+          <w:i/>
+          <w:iCs/>
+        </w:rPr>
+        <w:t>log_level = os.environ.get('LOG_LEVEL', 'WARNING')</w:t>
+      </w:r>
+    </w:p>
+    <w:p>
+      <w:pPr>
+        <w:rPr>
+          <w:i/>
+          <w:iCs/>
+        </w:rPr>
+      </w:pPr>
+      <w:r>
+        <w:rPr>
+          <w:i/>
+          <w:iCs/>
+        </w:rPr>
+        <w:t>max_size = int(os.environ.get('MAX_DOCUMENT_SIZE_MB', 10))</w:t>
+      </w:r>
+    </w:p>
+    <w:p>
+      <w:r>
+        <w:t>App Services encrypts ALL those variables and decrypts them only when injecting them into the environment, regardless of whether they contain sensitive data or not.</w:t>
+      </w:r>
+    </w:p>
+    <w:p>
+      <w:pPr>
+        <w:rPr>
+          <w:i/>
+          <w:iCs/>
+        </w:rPr>
+      </w:pPr>
+      <w:r>
+        <w:t xml:space="preserve">The keys can only contain letters, numbers and underscores. When using .NET in a Linux container you must use double underscore instead of colons, for example: </w:t>
+      </w:r>
+      <w:r>
+        <w:rPr>
+          <w:i/>
+          <w:iCs/>
+        </w:rPr>
+        <w:t>ConnectionStrings__DefaultConnection</w:t>
+      </w:r>
+      <w:r>
+        <w:t xml:space="preserve"> instead of </w:t>
+      </w:r>
+      <w:r>
+        <w:rPr>
+          <w:i/>
+          <w:iCs/>
+        </w:rPr>
+        <w:t>ConnectionStrings:DefaultConnection</w:t>
+      </w:r>
+    </w:p>
+    <w:p>
+      <w:pPr>
+        <w:pStyle w:val="Heading5"/>
+      </w:pPr>
+      <w:r>
+        <w:t>App settings (connection strings)</w:t>
+      </w:r>
+    </w:p>
+    <w:p>
+      <w:r>
+        <w:t>Connection strings are a specialized kind of app settings where you specify the type of database you will connect:</w:t>
+      </w:r>
+    </w:p>
+    <w:p>
+      <w:pPr>
+        <w:rPr>
+          <w:i/>
+          <w:iCs/>
+        </w:rPr>
+      </w:pPr>
+      <w:r>
+        <w:rPr>
+          <w:i/>
+          <w:iCs/>
+        </w:rPr>
+        <w:t>az webapp config connection-string set --resource-group myResourceGroup --name myDocumentProcessor --connection-string-type SQLAzure --settings DefaultConnection="Server=myserver.database.windows.net;Database=mydb;..."</w:t>
+      </w:r>
+    </w:p>
+    <w:p>
+      <w:r>
+        <w:t>In this command, for example, you’re specifying you will connect to a SQL Azure database and after that you specify the connection string. When you register a connection string, they are exposed by an specific variable name, depending on the database type you specified in the command:</w:t>
+      </w:r>
+    </w:p>
+    <w:tbl>
+      <w:tblPr>
+        <w:tblW w:w="12936" w:type="dxa"/>
+        <w:tblBorders>
+          <w:top w:val="single" w:sz="4" w:space="0" w:color="D1D1D1"/>
+          <w:left w:val="single" w:sz="4" w:space="0" w:color="D1D1D1"/>
+          <w:bottom w:val="single" w:sz="4" w:space="0" w:color="D1D1D1"/>
+          <w:right w:val="single" w:sz="4" w:space="0" w:color="D1D1D1"/>
+        </w:tblBorders>
+        <w:shd w:val="clear" w:color="auto" w:fill="FFFFFF"/>
+        <w:tblCellMar>
+          <w:top w:w="15" w:type="dxa"/>
+          <w:left w:w="15" w:type="dxa"/>
+          <w:bottom w:w="15" w:type="dxa"/>
+          <w:right w:w="15" w:type="dxa"/>
+        </w:tblCellMar>
+        <w:tblLook w:val="04A0" w:firstRow="1" w:lastRow="0" w:firstColumn="1" w:lastColumn="0" w:noHBand="0" w:noVBand="1"/>
+      </w:tblPr>
+      <w:tblGrid>
+        <w:gridCol w:w="3737"/>
+        <w:gridCol w:w="9199"/>
+      </w:tblGrid>
+      <w:tr>
+        <w:trPr>
+          <w:tblHeader/>
+        </w:trPr>
+        <w:tc>
+          <w:tcPr>
+            <w:tcW w:w="0" w:type="auto"/>
+            <w:shd w:val="clear" w:color="auto" w:fill="FFFFFF"/>
+            <w:hideMark/>
+          </w:tcPr>
+          <w:p>
+            <w:pPr>
+              <w:rPr>
+                <w:b/>
+                <w:bCs/>
+              </w:rPr>
+            </w:pPr>
+            <w:r>
+              <w:rPr>
+                <w:b/>
+                <w:bCs/>
+              </w:rPr>
+              <w:t>Type</w:t>
+            </w:r>
+          </w:p>
+        </w:tc>
+        <w:tc>
+          <w:tcPr>
+            <w:tcW w:w="0" w:type="auto"/>
+            <w:shd w:val="clear" w:color="auto" w:fill="FFFFFF"/>
+            <w:hideMark/>
+          </w:tcPr>
+          <w:p>
+            <w:pPr>
+              <w:rPr>
+                <w:b/>
+                <w:bCs/>
+              </w:rPr>
+            </w:pPr>
+            <w:r>
+              <w:rPr>
+                <w:b/>
+                <w:bCs/>
+              </w:rPr>
+              <w:t>Environment Variable Prefix</w:t>
+            </w:r>
+          </w:p>
+        </w:tc>
+      </w:tr>
+      <w:tr>
+        <w:tc>
+          <w:tcPr>
+            <w:tcW w:w="0" w:type="auto"/>
+            <w:shd w:val="clear" w:color="auto" w:fill="FFFFFF"/>
+            <w:hideMark/>
+          </w:tcPr>
+          <w:p>
+            <w:r>
+              <w:t>SQL Server</w:t>
+            </w:r>
+          </w:p>
+        </w:tc>
+        <w:tc>
+          <w:tcPr>
+            <w:tcW w:w="0" w:type="auto"/>
+            <w:shd w:val="clear" w:color="auto" w:fill="FFFFFF"/>
+            <w:hideMark/>
+          </w:tcPr>
+          <w:p>
+            <w:r>
+              <w:t>SQLCONNSTR_</w:t>
+            </w:r>
+          </w:p>
+        </w:tc>
+      </w:tr>
+      <w:tr>
+        <w:tc>
+          <w:tcPr>
+            <w:tcW w:w="0" w:type="auto"/>
+            <w:shd w:val="clear" w:color="auto" w:fill="FFFFFF"/>
+            <w:hideMark/>
+          </w:tcPr>
+          <w:p>
+            <w:r>
+              <w:t>SQL Azure</w:t>
+            </w:r>
+          </w:p>
+        </w:tc>
+        <w:tc>
+          <w:tcPr>
+            <w:tcW w:w="0" w:type="auto"/>
+            <w:shd w:val="clear" w:color="auto" w:fill="FFFFFF"/>
+            <w:hideMark/>
+          </w:tcPr>
+          <w:p>
+            <w:r>
+              <w:t>SQLAZURECONNSTR_</w:t>
+            </w:r>
+          </w:p>
+        </w:tc>
+      </w:tr>
+      <w:tr>
+        <w:tc>
+          <w:tcPr>
+            <w:tcW w:w="0" w:type="auto"/>
+            <w:shd w:val="clear" w:color="auto" w:fill="FFFFFF"/>
+            <w:hideMark/>
+          </w:tcPr>
+          <w:p>
+            <w:r>
+              <w:t>MySQL</w:t>
+            </w:r>
+          </w:p>
+        </w:tc>
+        <w:tc>
+          <w:tcPr>
+            <w:tcW w:w="0" w:type="auto"/>
+            <w:shd w:val="clear" w:color="auto" w:fill="FFFFFF"/>
+            <w:hideMark/>
+          </w:tcPr>
+          <w:p>
+            <w:r>
+              <w:t>MYSQLCONNSTR_</w:t>
+            </w:r>
+          </w:p>
+        </w:tc>
+      </w:tr>
+      <w:tr>
+        <w:tc>
+          <w:tcPr>
+            <w:tcW w:w="0" w:type="auto"/>
+            <w:shd w:val="clear" w:color="auto" w:fill="FFFFFF"/>
+            <w:hideMark/>
+          </w:tcPr>
+          <w:p>
+            <w:r>
+              <w:t>PostgreSQL</w:t>
+            </w:r>
+          </w:p>
+        </w:tc>
+        <w:tc>
+          <w:tcPr>
+            <w:tcW w:w="0" w:type="auto"/>
+            <w:shd w:val="clear" w:color="auto" w:fill="FFFFFF"/>
+            <w:hideMark/>
+          </w:tcPr>
+          <w:p>
+            <w:r>
+              <w:t>POSTGRESQLCONNSTR_</w:t>
+            </w:r>
+          </w:p>
+        </w:tc>
+      </w:tr>
+      <w:tr>
+        <w:tc>
+          <w:tcPr>
+            <w:tcW w:w="0" w:type="auto"/>
+            <w:shd w:val="clear" w:color="auto" w:fill="FFFFFF"/>
+            <w:hideMark/>
+          </w:tcPr>
+          <w:p>
+            <w:r>
+              <w:t>Custom</w:t>
+            </w:r>
+          </w:p>
+        </w:tc>
+        <w:tc>
+          <w:tcPr>
+            <w:tcW w:w="0" w:type="auto"/>
+            <w:shd w:val="clear" w:color="auto" w:fill="FFFFFF"/>
+            <w:hideMark/>
+          </w:tcPr>
+          <w:p>
+            <w:r>
+              <w:t>CUSTOMCONNSTR_</w:t>
+            </w:r>
+          </w:p>
+        </w:tc>
+      </w:tr>
+    </w:tbl>
+    <w:p/>
+    <w:p>
+      <w:r>
+        <w:lastRenderedPageBreak/>
+        <w:t>These kinds of app settings are recommended for .NET applications. For non-.NET apps, such as NodeJS or Python apps, it’s recommended to use normal app settings for database connections.</w:t>
+      </w:r>
+    </w:p>
+    <w:p>
+      <w:pPr>
+        <w:pStyle w:val="Heading5"/>
+      </w:pPr>
+      <w:r>
+        <w:t>Bulk editing</w:t>
+      </w:r>
+    </w:p>
+    <w:p>
+      <w:r>
+        <w:t>When configuring many settings, you might want to use bulk editing since it’s more efficient than issuing individual commands. You can export</w:t>
+      </w:r>
+      <w:r>
+        <w:t xml:space="preserve"> settings as JSON, modify them or import the updated configuration.</w:t>
+      </w:r>
+    </w:p>
+    <w:p>
+      <w:r>
+        <w:t>You can import the App Service’s instance current container by issuing this command:</w:t>
+      </w:r>
+    </w:p>
+    <w:p>
+      <w:pPr>
+        <w:rPr>
+          <w:i/>
+          <w:iCs/>
+        </w:rPr>
+      </w:pPr>
+      <w:r>
+        <w:rPr>
+          <w:i/>
+          <w:iCs/>
+        </w:rPr>
+        <w:t>az webapp config appsettings list --resource-group myResourceGroup --name myDocumentProcessor --output json &gt; settings.json</w:t>
+      </w:r>
+    </w:p>
+    <w:p>
+      <w:r>
+        <w:t>And this will export a JSON like this:</w:t>
+      </w:r>
+    </w:p>
+    <w:p>
+      <w:pPr>
+        <w:spacing w:line="240" w:lineRule="auto"/>
+        <w:rPr>
+          <w:i/>
+          <w:iCs/>
+        </w:rPr>
+      </w:pPr>
+      <w:r>
+        <w:rPr>
+          <w:i/>
+          <w:iCs/>
+        </w:rPr>
+        <w:t>[</w:t>
+      </w:r>
+    </w:p>
+    <w:p>
+      <w:pPr>
+        <w:spacing w:line="240" w:lineRule="auto"/>
+        <w:rPr>
+          <w:i/>
+          <w:iCs/>
+        </w:rPr>
+      </w:pPr>
+      <w:r>
+        <w:rPr>
+          <w:i/>
+          <w:iCs/>
+        </w:rPr>
+        <w:t xml:space="preserve">  {</w:t>
+      </w:r>
+    </w:p>
+    <w:p>
+      <w:pPr>
+        <w:spacing w:line="240" w:lineRule="auto"/>
+        <w:rPr>
+          <w:i/>
+          <w:iCs/>
+        </w:rPr>
+      </w:pPr>
+      <w:r>
+        <w:rPr>
+          <w:i/>
+          <w:iCs/>
+        </w:rPr>
+        <w:t xml:space="preserve">    "name": "STORAGE_ACCOUNT_NAME",</w:t>
+      </w:r>
+    </w:p>
+    <w:p>
+      <w:pPr>
+        <w:spacing w:line="240" w:lineRule="auto"/>
+        <w:rPr>
+          <w:i/>
+          <w:iCs/>
+        </w:rPr>
+      </w:pPr>
+      <w:r>
+        <w:rPr>
+          <w:i/>
+          <w:iCs/>
+        </w:rPr>
+        <w:t xml:space="preserve">    "value": "mystorageaccount",</w:t>
+      </w:r>
+    </w:p>
+    <w:p>
+      <w:pPr>
+        <w:spacing w:line="240" w:lineRule="auto"/>
+        <w:rPr>
+          <w:i/>
+          <w:iCs/>
+        </w:rPr>
+      </w:pPr>
+      <w:r>
+        <w:rPr>
+          <w:i/>
+          <w:iCs/>
+        </w:rPr>
+        <w:t xml:space="preserve">    "slotSetting": false</w:t>
+      </w:r>
+    </w:p>
+    <w:p>
+      <w:pPr>
+        <w:spacing w:line="240" w:lineRule="auto"/>
+        <w:rPr>
+          <w:i/>
+          <w:iCs/>
+        </w:rPr>
+      </w:pPr>
+      <w:r>
+        <w:rPr>
+          <w:i/>
+          <w:iCs/>
+        </w:rPr>
+        <w:t xml:space="preserve">  },</w:t>
+      </w:r>
+    </w:p>
+    <w:p>
+      <w:pPr>
+        <w:spacing w:line="240" w:lineRule="auto"/>
+        <w:rPr>
+          <w:i/>
+          <w:iCs/>
+        </w:rPr>
+      </w:pPr>
+      <w:r>
+        <w:rPr>
+          <w:i/>
+          <w:iCs/>
+        </w:rPr>
+        <w:t xml:space="preserve">  {</w:t>
+      </w:r>
+    </w:p>
+    <w:p>
+      <w:pPr>
+        <w:spacing w:line="240" w:lineRule="auto"/>
+        <w:rPr>
+          <w:i/>
+          <w:iCs/>
+        </w:rPr>
+      </w:pPr>
+      <w:r>
+        <w:rPr>
+          <w:i/>
+          <w:iCs/>
+        </w:rPr>
+        <w:t xml:space="preserve">    "name": "LOG_LEVEL",</w:t>
+      </w:r>
+    </w:p>
+    <w:p>
+      <w:pPr>
+        <w:spacing w:line="240" w:lineRule="auto"/>
+        <w:rPr>
+          <w:i/>
+          <w:iCs/>
+        </w:rPr>
+      </w:pPr>
+      <w:r>
+        <w:rPr>
+          <w:i/>
+          <w:iCs/>
+        </w:rPr>
+        <w:t xml:space="preserve">    "value": "INFO",</w:t>
+      </w:r>
+    </w:p>
+    <w:p>
+      <w:pPr>
+        <w:spacing w:line="240" w:lineRule="auto"/>
+        <w:rPr>
+          <w:i/>
+          <w:iCs/>
+        </w:rPr>
+      </w:pPr>
+      <w:r>
+        <w:rPr>
+          <w:i/>
+          <w:iCs/>
+        </w:rPr>
+        <w:t xml:space="preserve">    "slotSetting": false</w:t>
+      </w:r>
+    </w:p>
+    <w:p>
+      <w:pPr>
+        <w:spacing w:line="240" w:lineRule="auto"/>
+        <w:rPr>
+          <w:i/>
+          <w:iCs/>
+        </w:rPr>
+      </w:pPr>
+      <w:r>
+        <w:rPr>
+          <w:i/>
+          <w:iCs/>
+        </w:rPr>
+        <w:t xml:space="preserve">  }</w:t>
+      </w:r>
+    </w:p>
+    <w:p>
+      <w:pPr>
+        <w:spacing w:line="240" w:lineRule="auto"/>
+        <w:rPr>
+          <w:i/>
+          <w:iCs/>
+        </w:rPr>
+      </w:pPr>
+      <w:r>
+        <w:rPr>
+          <w:i/>
+          <w:iCs/>
+        </w:rPr>
+        <w:t>]</w:t>
+      </w:r>
+    </w:p>
+    <w:p>
+      <w:pPr>
+        <w:spacing w:line="240" w:lineRule="auto"/>
+      </w:pPr>
+      <w:r>
+        <w:t>You can make the reverse operation and export a JSON to update the settings at once:</w:t>
+      </w:r>
+    </w:p>
+    <w:p>
+      <w:pPr>
+        <w:spacing w:line="240" w:lineRule="auto"/>
+      </w:pPr>
+      <w:r>
+        <w:rPr>
+          <w:i/>
+          <w:iCs/>
+        </w:rPr>
+        <w:t>az webapp config appsettings set --resource-group myResourceGroup --name myDocumentProcessor --settings @settings.json</w:t>
+      </w:r>
+    </w:p>
+    <w:p>
+      <w:pPr>
+        <w:spacing w:line="240" w:lineRule="auto"/>
+      </w:pPr>
+      <w:r>
+        <w:t xml:space="preserve">You use </w:t>
+      </w:r>
+      <w:r>
+        <w:rPr>
+          <w:i/>
+          <w:iCs/>
+        </w:rPr>
+        <w:t>@</w:t>
+      </w:r>
+      <w:r>
+        <w:t xml:space="preserve"> prefix to read from the file.</w:t>
+      </w:r>
+    </w:p>
+    <w:p>
+      <w:pPr>
+        <w:pStyle w:val="Heading5"/>
+      </w:pPr>
+      <w:r>
+        <w:t>Slots</w:t>
+      </w:r>
+    </w:p>
+    <w:p>
+      <w:r>
+        <w:t>Deployment slots allow you to run different versions of your app side-by-side within the same App Service plan. Each slot has its own hostname and configuration</w:t>
+      </w:r>
+      <w:r>
+        <w:t>,</w:t>
+      </w:r>
+      <w:r>
+        <w:t xml:space="preserve"> but it shares </w:t>
+      </w:r>
+      <w:r>
+        <w:lastRenderedPageBreak/>
+        <w:t>the underlying compute resources of the plan with the production slot</w:t>
+      </w:r>
+      <w:r>
+        <w:t>. You can swap slots to promote changes from staging to production quickly</w:t>
+      </w:r>
+      <w:r>
+        <w:t>:</w:t>
+      </w:r>
+    </w:p>
+    <w:p>
+      <w:pPr>
+        <w:rPr>
+          <w:i/>
+          <w:iCs/>
+        </w:rPr>
+      </w:pPr>
+      <w:r>
+        <w:rPr>
+          <w:i/>
+          <w:iCs/>
+        </w:rPr>
+        <w:t>az webapp config appsettings set --resource-group myResourceGroup --name myDocumentProcessor --slot staging --slot-settings ENVIRONMENT=staging API_ENDPOINT=https://api-staging.example.com</w:t>
+      </w:r>
+    </w:p>
+    <w:p>
+      <w:r>
+        <w:t xml:space="preserve">Here you set the </w:t>
+      </w:r>
+      <w:r>
+        <w:rPr>
+          <w:i/>
+          <w:iCs/>
+        </w:rPr>
+        <w:t>ENVIRONMENT</w:t>
+      </w:r>
+      <w:r>
+        <w:t xml:space="preserve"> and </w:t>
+      </w:r>
+      <w:r>
+        <w:rPr>
+          <w:i/>
+          <w:iCs/>
+        </w:rPr>
+        <w:t>API_ENDPOINT</w:t>
+      </w:r>
+      <w:r>
+        <w:t xml:space="preserve"> to the </w:t>
+      </w:r>
+      <w:r>
+        <w:rPr>
+          <w:i/>
+          <w:iCs/>
+        </w:rPr>
+        <w:t>staging</w:t>
+      </w:r>
+      <w:r>
+        <w:t xml:space="preserve"> slot. The  settings are marked as slot settings, it means that the settings will remain with the slot during swap operations, so the application will get the settings in the slot. This behavior is important for:</w:t>
+      </w:r>
+    </w:p>
+    <w:p>
+      <w:pPr>
+        <w:pStyle w:val="ListParagraph"/>
+        <w:numPr>
+          <w:ilvl w:val="0"/>
+          <w:numId w:val="18"/>
+        </w:numPr>
+        <w:rPr>
+          <w:b/>
+          <w:bCs/>
+        </w:rPr>
+      </w:pPr>
+      <w:r>
+        <w:rPr>
+          <w:b/>
+          <w:bCs/>
+        </w:rPr>
+        <w:t xml:space="preserve">Environment identifiers: </w:t>
+      </w:r>
+      <w:r>
+        <w:t xml:space="preserve">Settings like </w:t>
+      </w:r>
+      <w:r>
+        <w:rPr>
+          <w:i/>
+          <w:iCs/>
+        </w:rPr>
+        <w:t xml:space="preserve">ENVIRONMENT=production </w:t>
+      </w:r>
+      <w:r>
+        <w:t>shouldn’t swap to staging.</w:t>
+      </w:r>
+    </w:p>
+    <w:p>
+      <w:pPr>
+        <w:pStyle w:val="ListParagraph"/>
+        <w:numPr>
+          <w:ilvl w:val="0"/>
+          <w:numId w:val="18"/>
+        </w:numPr>
+        <w:rPr>
+          <w:b/>
+          <w:bCs/>
+        </w:rPr>
+      </w:pPr>
+      <w:r>
+        <w:rPr>
+          <w:b/>
+          <w:bCs/>
+        </w:rPr>
+        <w:t xml:space="preserve">Environment-specific endpoints: </w:t>
+      </w:r>
+      <w:r>
+        <w:t>API URLs or database connections that differ between environments.</w:t>
+      </w:r>
+    </w:p>
+    <w:p>
+      <w:pPr>
+        <w:pStyle w:val="ListParagraph"/>
+        <w:numPr>
+          <w:ilvl w:val="0"/>
+          <w:numId w:val="18"/>
+        </w:numPr>
+        <w:rPr>
+          <w:b/>
+          <w:bCs/>
+        </w:rPr>
+      </w:pPr>
+      <w:r>
+        <w:rPr>
+          <w:b/>
+          <w:bCs/>
+        </w:rPr>
+        <w:t xml:space="preserve">Feature flags: </w:t>
+      </w:r>
+      <w:r>
+        <w:t>Settings that enable features only in specific environments.</w:t>
+      </w:r>
+    </w:p>
+    <w:p>
+      <w:pPr>
+        <w:pStyle w:val="ListParagraph"/>
+        <w:numPr>
+          <w:ilvl w:val="0"/>
+          <w:numId w:val="18"/>
+        </w:numPr>
+        <w:rPr>
+          <w:b/>
+          <w:bCs/>
+        </w:rPr>
+      </w:pPr>
+      <w:r>
+        <w:rPr>
+          <w:b/>
+          <w:bCs/>
+        </w:rPr>
+        <w:t xml:space="preserve">Diagnostic settings: </w:t>
+      </w:r>
+      <w:r>
+        <w:t>Verbose logging in staging that shouldn’t affect production.</w:t>
+      </w:r>
+    </w:p>
+    <w:p>
+      <w:r>
+        <w:t xml:space="preserve">To see </w:t>
+      </w:r>
+      <w:r>
+        <w:t>which settings are configured as slot settings:</w:t>
+      </w:r>
+    </w:p>
+    <w:p>
+      <w:r>
+        <w:rPr>
+          <w:i/>
+          <w:iCs/>
+        </w:rPr>
+        <w:t>az webapp config appsettings list --resource-group myResourceGroup --name myDocumentProcessor --query "[?slotSetting==\`true\`].name"</w:t>
+      </w:r>
+    </w:p>
+    <w:p>
+      <w:pPr>
+        <w:pStyle w:val="Heading5"/>
+      </w:pPr>
+      <w:r>
+        <w:t>Key vault references</w:t>
+      </w:r>
+    </w:p>
+    <w:p>
+      <w:r>
+        <w:t>For secrets that require centralized management, audit trails or automatic rotation, App Service supports referencing values stored in Azure Key Vault. The application reads resolved values as standard environment variables without code changes:</w:t>
+      </w:r>
+    </w:p>
+    <w:p>
+      <w:r>
+        <w:rPr>
+          <w:i/>
+          <w:iCs/>
+        </w:rPr>
+        <w:t>az webapp config appsettings set --resource-group myResourceGroup --name myDocumentProcessor --settings API_KEY="@Microsoft.KeyVault(SecretUri=https://myvault.vault.azure.net/secrets/api-key)"</w:t>
+      </w:r>
+    </w:p>
+    <w:p>
+      <w:r>
+        <w:t>App Service resolves the reference to the Key Vault and injects the secrets in the specified environment variable.</w:t>
+      </w:r>
+    </w:p>
+    <w:p>
+      <w:r>
+        <w:t>Key Vault references require:</w:t>
+      </w:r>
+    </w:p>
+    <w:p>
+      <w:pPr>
+        <w:pStyle w:val="ListParagraph"/>
+        <w:numPr>
+          <w:ilvl w:val="0"/>
+          <w:numId w:val="19"/>
+        </w:numPr>
+      </w:pPr>
+      <w:r>
+        <w:t>A managed identity enabled on the web app.</w:t>
+      </w:r>
+    </w:p>
+    <w:p>
+      <w:pPr>
+        <w:pStyle w:val="ListParagraph"/>
+        <w:numPr>
+          <w:ilvl w:val="0"/>
+          <w:numId w:val="19"/>
+        </w:numPr>
+      </w:pPr>
+      <w:r>
+        <w:t>The managed identity granted access to read secrets from the Key Vault.</w:t>
+      </w:r>
+    </w:p>
+    <w:p>
+      <w:pPr>
+        <w:pStyle w:val="ListParagraph"/>
+        <w:numPr>
+          <w:ilvl w:val="0"/>
+          <w:numId w:val="19"/>
+        </w:numPr>
+      </w:pPr>
+      <w:r>
+        <w:t>The Key Vault reference syntax in the app setting value.</w:t>
+      </w:r>
+    </w:p>
+    <w:p>
+      <w:r>
+        <w:t xml:space="preserve">References without a version specifier automatically resolve to the latest secret version. When a secret rotates, App Service refreshes resolved values within 24 hours. Any </w:t>
+      </w:r>
+      <w:r>
+        <w:lastRenderedPageBreak/>
+        <w:t>configuration change that trigger an app restart also forces an immediate refetch of referenced secrets.</w:t>
+      </w:r>
+    </w:p>
     <w:p/>
     <w:p/>
     <w:sectPr>
@@ -2554,7 +5186,7 @@
   <w:abstractNum w:abstractNumId="0" w15:restartNumberingAfterBreak="0">
     <w:nsid w:val="0BA5639B"/>
     <w:multiLevelType w:val="multilevel"/>
-    <w:tmpl w:val="0C0ED872"/>
+    <w:tmpl w:val="3AF66C50"/>
     <w:lvl w:ilvl="0">
       <w:start w:val="1"/>
       <w:numFmt w:val="bullet"/>
@@ -2571,20 +5203,16 @@
         <w:sz w:val="20"/>
       </w:rPr>
     </w:lvl>
-    <w:lvl w:ilvl="1" w:tentative="1">
-      <w:start w:val="1"/>
-      <w:numFmt w:val="bullet"/>
-      <w:lvlText w:val="o"/>
-      <w:lvlJc w:val="left"/>
-      <w:pPr>
-        <w:tabs>
-          <w:tab w:val="num" w:pos="1440"/>
-        </w:tabs>
+    <w:lvl w:ilvl="1">
+      <w:start w:val="1"/>
+      <w:numFmt w:val="decimal"/>
+      <w:lvlText w:val="%2."/>
+      <w:lvlJc w:val="left"/>
+      <w:pPr>
         <w:ind w:left="1440" w:hanging="360"/>
       </w:pPr>
       <w:rPr>
-        <w:rFonts w:ascii="Courier New" w:hAnsi="Courier New" w:hint="default"/>
-        <w:sz w:val="20"/>
+        <w:rFonts w:hint="default"/>
       </w:rPr>
     </w:lvl>
     <w:lvl w:ilvl="2" w:tentative="1">
@@ -3189,6 +5817,268 @@
     </w:lvl>
   </w:abstractNum>
   <w:abstractNum w:abstractNumId="5" w15:restartNumberingAfterBreak="0">
+    <w:nsid w:val="28BE32E4"/>
+    <w:multiLevelType w:val="hybridMultilevel"/>
+    <w:tmpl w:val="3362A1DC"/>
+    <w:lvl w:ilvl="0" w:tplc="04090001">
+      <w:start w:val="1"/>
+      <w:numFmt w:val="bullet"/>
+      <w:lvlText w:val=""/>
+      <w:lvlJc w:val="left"/>
+      <w:pPr>
+        <w:ind w:left="720" w:hanging="360"/>
+      </w:pPr>
+      <w:rPr>
+        <w:rFonts w:ascii="Symbol" w:hAnsi="Symbol" w:hint="default"/>
+      </w:rPr>
+    </w:lvl>
+    <w:lvl w:ilvl="1" w:tplc="04090003" w:tentative="1">
+      <w:start w:val="1"/>
+      <w:numFmt w:val="bullet"/>
+      <w:lvlText w:val="o"/>
+      <w:lvlJc w:val="left"/>
+      <w:pPr>
+        <w:ind w:left="1440" w:hanging="360"/>
+      </w:pPr>
+      <w:rPr>
+        <w:rFonts w:ascii="Courier New" w:hAnsi="Courier New" w:cs="Courier New" w:hint="default"/>
+      </w:rPr>
+    </w:lvl>
+    <w:lvl w:ilvl="2" w:tplc="04090005" w:tentative="1">
+      <w:start w:val="1"/>
+      <w:numFmt w:val="bullet"/>
+      <w:lvlText w:val=""/>
+      <w:lvlJc w:val="left"/>
+      <w:pPr>
+        <w:ind w:left="2160" w:hanging="360"/>
+      </w:pPr>
+      <w:rPr>
+        <w:rFonts w:ascii="Wingdings" w:hAnsi="Wingdings" w:hint="default"/>
+      </w:rPr>
+    </w:lvl>
+    <w:lvl w:ilvl="3" w:tplc="04090001" w:tentative="1">
+      <w:start w:val="1"/>
+      <w:numFmt w:val="bullet"/>
+      <w:lvlText w:val=""/>
+      <w:lvlJc w:val="left"/>
+      <w:pPr>
+        <w:ind w:left="2880" w:hanging="360"/>
+      </w:pPr>
+      <w:rPr>
+        <w:rFonts w:ascii="Symbol" w:hAnsi="Symbol" w:hint="default"/>
+      </w:rPr>
+    </w:lvl>
+    <w:lvl w:ilvl="4" w:tplc="04090003" w:tentative="1">
+      <w:start w:val="1"/>
+      <w:numFmt w:val="bullet"/>
+      <w:lvlText w:val="o"/>
+      <w:lvlJc w:val="left"/>
+      <w:pPr>
+        <w:ind w:left="3600" w:hanging="360"/>
+      </w:pPr>
+      <w:rPr>
+        <w:rFonts w:ascii="Courier New" w:hAnsi="Courier New" w:cs="Courier New" w:hint="default"/>
+      </w:rPr>
+    </w:lvl>
+    <w:lvl w:ilvl="5" w:tplc="04090005" w:tentative="1">
+      <w:start w:val="1"/>
+      <w:numFmt w:val="bullet"/>
+      <w:lvlText w:val=""/>
+      <w:lvlJc w:val="left"/>
+      <w:pPr>
+        <w:ind w:left="4320" w:hanging="360"/>
+      </w:pPr>
+      <w:rPr>
+        <w:rFonts w:ascii="Wingdings" w:hAnsi="Wingdings" w:hint="default"/>
+      </w:rPr>
+    </w:lvl>
+    <w:lvl w:ilvl="6" w:tplc="04090001" w:tentative="1">
+      <w:start w:val="1"/>
+      <w:numFmt w:val="bullet"/>
+      <w:lvlText w:val=""/>
+      <w:lvlJc w:val="left"/>
+      <w:pPr>
+        <w:ind w:left="5040" w:hanging="360"/>
+      </w:pPr>
+      <w:rPr>
+        <w:rFonts w:ascii="Symbol" w:hAnsi="Symbol" w:hint="default"/>
+      </w:rPr>
+    </w:lvl>
+    <w:lvl w:ilvl="7" w:tplc="04090003" w:tentative="1">
+      <w:start w:val="1"/>
+      <w:numFmt w:val="bullet"/>
+      <w:lvlText w:val="o"/>
+      <w:lvlJc w:val="left"/>
+      <w:pPr>
+        <w:ind w:left="5760" w:hanging="360"/>
+      </w:pPr>
+      <w:rPr>
+        <w:rFonts w:ascii="Courier New" w:hAnsi="Courier New" w:cs="Courier New" w:hint="default"/>
+      </w:rPr>
+    </w:lvl>
+    <w:lvl w:ilvl="8" w:tplc="04090005" w:tentative="1">
+      <w:start w:val="1"/>
+      <w:numFmt w:val="bullet"/>
+      <w:lvlText w:val=""/>
+      <w:lvlJc w:val="left"/>
+      <w:pPr>
+        <w:ind w:left="6480" w:hanging="360"/>
+      </w:pPr>
+      <w:rPr>
+        <w:rFonts w:ascii="Wingdings" w:hAnsi="Wingdings" w:hint="default"/>
+      </w:rPr>
+    </w:lvl>
+  </w:abstractNum>
+  <w:abstractNum w:abstractNumId="6" w15:restartNumberingAfterBreak="0">
+    <w:nsid w:val="2EE663AC"/>
+    <w:multiLevelType w:val="multilevel"/>
+    <w:tmpl w:val="0952DE48"/>
+    <w:lvl w:ilvl="0">
+      <w:start w:val="1"/>
+      <w:numFmt w:val="bullet"/>
+      <w:lvlText w:val=""/>
+      <w:lvlJc w:val="left"/>
+      <w:pPr>
+        <w:tabs>
+          <w:tab w:val="num" w:pos="720"/>
+        </w:tabs>
+        <w:ind w:left="720" w:hanging="360"/>
+      </w:pPr>
+      <w:rPr>
+        <w:rFonts w:ascii="Symbol" w:hAnsi="Symbol" w:hint="default"/>
+        <w:sz w:val="20"/>
+      </w:rPr>
+    </w:lvl>
+    <w:lvl w:ilvl="1" w:tentative="1">
+      <w:start w:val="1"/>
+      <w:numFmt w:val="bullet"/>
+      <w:lvlText w:val="o"/>
+      <w:lvlJc w:val="left"/>
+      <w:pPr>
+        <w:tabs>
+          <w:tab w:val="num" w:pos="1440"/>
+        </w:tabs>
+        <w:ind w:left="1440" w:hanging="360"/>
+      </w:pPr>
+      <w:rPr>
+        <w:rFonts w:ascii="Courier New" w:hAnsi="Courier New" w:hint="default"/>
+        <w:sz w:val="20"/>
+      </w:rPr>
+    </w:lvl>
+    <w:lvl w:ilvl="2" w:tentative="1">
+      <w:start w:val="1"/>
+      <w:numFmt w:val="bullet"/>
+      <w:lvlText w:val=""/>
+      <w:lvlJc w:val="left"/>
+      <w:pPr>
+        <w:tabs>
+          <w:tab w:val="num" w:pos="2160"/>
+        </w:tabs>
+        <w:ind w:left="2160" w:hanging="360"/>
+      </w:pPr>
+      <w:rPr>
+        <w:rFonts w:ascii="Wingdings" w:hAnsi="Wingdings" w:hint="default"/>
+        <w:sz w:val="20"/>
+      </w:rPr>
+    </w:lvl>
+    <w:lvl w:ilvl="3" w:tentative="1">
+      <w:start w:val="1"/>
+      <w:numFmt w:val="bullet"/>
+      <w:lvlText w:val=""/>
+      <w:lvlJc w:val="left"/>
+      <w:pPr>
+        <w:tabs>
+          <w:tab w:val="num" w:pos="2880"/>
+        </w:tabs>
+        <w:ind w:left="2880" w:hanging="360"/>
+      </w:pPr>
+      <w:rPr>
+        <w:rFonts w:ascii="Wingdings" w:hAnsi="Wingdings" w:hint="default"/>
+        <w:sz w:val="20"/>
+      </w:rPr>
+    </w:lvl>
+    <w:lvl w:ilvl="4" w:tentative="1">
+      <w:start w:val="1"/>
+      <w:numFmt w:val="bullet"/>
+      <w:lvlText w:val=""/>
+      <w:lvlJc w:val="left"/>
+      <w:pPr>
+        <w:tabs>
+          <w:tab w:val="num" w:pos="3600"/>
+        </w:tabs>
+        <w:ind w:left="3600" w:hanging="360"/>
+      </w:pPr>
+      <w:rPr>
+        <w:rFonts w:ascii="Wingdings" w:hAnsi="Wingdings" w:hint="default"/>
+        <w:sz w:val="20"/>
+      </w:rPr>
+    </w:lvl>
+    <w:lvl w:ilvl="5" w:tentative="1">
+      <w:start w:val="1"/>
+      <w:numFmt w:val="bullet"/>
+      <w:lvlText w:val=""/>
+      <w:lvlJc w:val="left"/>
+      <w:pPr>
+        <w:tabs>
+          <w:tab w:val="num" w:pos="4320"/>
+        </w:tabs>
+        <w:ind w:left="4320" w:hanging="360"/>
+      </w:pPr>
+      <w:rPr>
+        <w:rFonts w:ascii="Wingdings" w:hAnsi="Wingdings" w:hint="default"/>
+        <w:sz w:val="20"/>
+      </w:rPr>
+    </w:lvl>
+    <w:lvl w:ilvl="6" w:tentative="1">
+      <w:start w:val="1"/>
+      <w:numFmt w:val="bullet"/>
+      <w:lvlText w:val=""/>
+      <w:lvlJc w:val="left"/>
+      <w:pPr>
+        <w:tabs>
+          <w:tab w:val="num" w:pos="5040"/>
+        </w:tabs>
+        <w:ind w:left="5040" w:hanging="360"/>
+      </w:pPr>
+      <w:rPr>
+        <w:rFonts w:ascii="Wingdings" w:hAnsi="Wingdings" w:hint="default"/>
+        <w:sz w:val="20"/>
+      </w:rPr>
+    </w:lvl>
+    <w:lvl w:ilvl="7" w:tentative="1">
+      <w:start w:val="1"/>
+      <w:numFmt w:val="bullet"/>
+      <w:lvlText w:val=""/>
+      <w:lvlJc w:val="left"/>
+      <w:pPr>
+        <w:tabs>
+          <w:tab w:val="num" w:pos="5760"/>
+        </w:tabs>
+        <w:ind w:left="5760" w:hanging="360"/>
+      </w:pPr>
+      <w:rPr>
+        <w:rFonts w:ascii="Wingdings" w:hAnsi="Wingdings" w:hint="default"/>
+        <w:sz w:val="20"/>
+      </w:rPr>
+    </w:lvl>
+    <w:lvl w:ilvl="8" w:tentative="1">
+      <w:start w:val="1"/>
+      <w:numFmt w:val="bullet"/>
+      <w:lvlText w:val=""/>
+      <w:lvlJc w:val="left"/>
+      <w:pPr>
+        <w:tabs>
+          <w:tab w:val="num" w:pos="6480"/>
+        </w:tabs>
+        <w:ind w:left="6480" w:hanging="360"/>
+      </w:pPr>
+      <w:rPr>
+        <w:rFonts w:ascii="Wingdings" w:hAnsi="Wingdings" w:hint="default"/>
+        <w:sz w:val="20"/>
+      </w:rPr>
+    </w:lvl>
+  </w:abstractNum>
+  <w:abstractNum w:abstractNumId="7" w15:restartNumberingAfterBreak="0">
     <w:nsid w:val="33DA68D7"/>
     <w:multiLevelType w:val="hybridMultilevel"/>
     <w:tmpl w:val="7C740C1E"/>
@@ -3301,7 +6191,7 @@
       </w:rPr>
     </w:lvl>
   </w:abstractNum>
-  <w:abstractNum w:abstractNumId="6" w15:restartNumberingAfterBreak="0">
+  <w:abstractNum w:abstractNumId="8" w15:restartNumberingAfterBreak="0">
     <w:nsid w:val="3E7E1CA9"/>
     <w:multiLevelType w:val="multilevel"/>
     <w:tmpl w:val="4B5C9E5C"/>
@@ -3450,7 +6340,7 @@
       </w:rPr>
     </w:lvl>
   </w:abstractNum>
-  <w:abstractNum w:abstractNumId="7" w15:restartNumberingAfterBreak="0">
+  <w:abstractNum w:abstractNumId="9" w15:restartNumberingAfterBreak="0">
     <w:nsid w:val="41F350E7"/>
     <w:multiLevelType w:val="hybridMultilevel"/>
     <w:tmpl w:val="E55E08C8"/>
@@ -3563,7 +6453,7 @@
       </w:rPr>
     </w:lvl>
   </w:abstractNum>
-  <w:abstractNum w:abstractNumId="8" w15:restartNumberingAfterBreak="0">
+  <w:abstractNum w:abstractNumId="10" w15:restartNumberingAfterBreak="0">
     <w:nsid w:val="4739155A"/>
     <w:multiLevelType w:val="hybridMultilevel"/>
     <w:tmpl w:val="B870380A"/>
@@ -3676,7 +6566,269 @@
       </w:rPr>
     </w:lvl>
   </w:abstractNum>
-  <w:abstractNum w:abstractNumId="9" w15:restartNumberingAfterBreak="0">
+  <w:abstractNum w:abstractNumId="11" w15:restartNumberingAfterBreak="0">
+    <w:nsid w:val="5D5F47B8"/>
+    <w:multiLevelType w:val="multilevel"/>
+    <w:tmpl w:val="58B81124"/>
+    <w:lvl w:ilvl="0">
+      <w:start w:val="1"/>
+      <w:numFmt w:val="bullet"/>
+      <w:lvlText w:val=""/>
+      <w:lvlJc w:val="left"/>
+      <w:pPr>
+        <w:tabs>
+          <w:tab w:val="num" w:pos="720"/>
+        </w:tabs>
+        <w:ind w:left="720" w:hanging="360"/>
+      </w:pPr>
+      <w:rPr>
+        <w:rFonts w:ascii="Symbol" w:hAnsi="Symbol" w:hint="default"/>
+        <w:sz w:val="20"/>
+      </w:rPr>
+    </w:lvl>
+    <w:lvl w:ilvl="1" w:tentative="1">
+      <w:start w:val="1"/>
+      <w:numFmt w:val="bullet"/>
+      <w:lvlText w:val="o"/>
+      <w:lvlJc w:val="left"/>
+      <w:pPr>
+        <w:tabs>
+          <w:tab w:val="num" w:pos="1440"/>
+        </w:tabs>
+        <w:ind w:left="1440" w:hanging="360"/>
+      </w:pPr>
+      <w:rPr>
+        <w:rFonts w:ascii="Courier New" w:hAnsi="Courier New" w:hint="default"/>
+        <w:sz w:val="20"/>
+      </w:rPr>
+    </w:lvl>
+    <w:lvl w:ilvl="2" w:tentative="1">
+      <w:start w:val="1"/>
+      <w:numFmt w:val="bullet"/>
+      <w:lvlText w:val=""/>
+      <w:lvlJc w:val="left"/>
+      <w:pPr>
+        <w:tabs>
+          <w:tab w:val="num" w:pos="2160"/>
+        </w:tabs>
+        <w:ind w:left="2160" w:hanging="360"/>
+      </w:pPr>
+      <w:rPr>
+        <w:rFonts w:ascii="Wingdings" w:hAnsi="Wingdings" w:hint="default"/>
+        <w:sz w:val="20"/>
+      </w:rPr>
+    </w:lvl>
+    <w:lvl w:ilvl="3" w:tentative="1">
+      <w:start w:val="1"/>
+      <w:numFmt w:val="bullet"/>
+      <w:lvlText w:val=""/>
+      <w:lvlJc w:val="left"/>
+      <w:pPr>
+        <w:tabs>
+          <w:tab w:val="num" w:pos="2880"/>
+        </w:tabs>
+        <w:ind w:left="2880" w:hanging="360"/>
+      </w:pPr>
+      <w:rPr>
+        <w:rFonts w:ascii="Wingdings" w:hAnsi="Wingdings" w:hint="default"/>
+        <w:sz w:val="20"/>
+      </w:rPr>
+    </w:lvl>
+    <w:lvl w:ilvl="4" w:tentative="1">
+      <w:start w:val="1"/>
+      <w:numFmt w:val="bullet"/>
+      <w:lvlText w:val=""/>
+      <w:lvlJc w:val="left"/>
+      <w:pPr>
+        <w:tabs>
+          <w:tab w:val="num" w:pos="3600"/>
+        </w:tabs>
+        <w:ind w:left="3600" w:hanging="360"/>
+      </w:pPr>
+      <w:rPr>
+        <w:rFonts w:ascii="Wingdings" w:hAnsi="Wingdings" w:hint="default"/>
+        <w:sz w:val="20"/>
+      </w:rPr>
+    </w:lvl>
+    <w:lvl w:ilvl="5" w:tentative="1">
+      <w:start w:val="1"/>
+      <w:numFmt w:val="bullet"/>
+      <w:lvlText w:val=""/>
+      <w:lvlJc w:val="left"/>
+      <w:pPr>
+        <w:tabs>
+          <w:tab w:val="num" w:pos="4320"/>
+        </w:tabs>
+        <w:ind w:left="4320" w:hanging="360"/>
+      </w:pPr>
+      <w:rPr>
+        <w:rFonts w:ascii="Wingdings" w:hAnsi="Wingdings" w:hint="default"/>
+        <w:sz w:val="20"/>
+      </w:rPr>
+    </w:lvl>
+    <w:lvl w:ilvl="6" w:tentative="1">
+      <w:start w:val="1"/>
+      <w:numFmt w:val="bullet"/>
+      <w:lvlText w:val=""/>
+      <w:lvlJc w:val="left"/>
+      <w:pPr>
+        <w:tabs>
+          <w:tab w:val="num" w:pos="5040"/>
+        </w:tabs>
+        <w:ind w:left="5040" w:hanging="360"/>
+      </w:pPr>
+      <w:rPr>
+        <w:rFonts w:ascii="Wingdings" w:hAnsi="Wingdings" w:hint="default"/>
+        <w:sz w:val="20"/>
+      </w:rPr>
+    </w:lvl>
+    <w:lvl w:ilvl="7" w:tentative="1">
+      <w:start w:val="1"/>
+      <w:numFmt w:val="bullet"/>
+      <w:lvlText w:val=""/>
+      <w:lvlJc w:val="left"/>
+      <w:pPr>
+        <w:tabs>
+          <w:tab w:val="num" w:pos="5760"/>
+        </w:tabs>
+        <w:ind w:left="5760" w:hanging="360"/>
+      </w:pPr>
+      <w:rPr>
+        <w:rFonts w:ascii="Wingdings" w:hAnsi="Wingdings" w:hint="default"/>
+        <w:sz w:val="20"/>
+      </w:rPr>
+    </w:lvl>
+    <w:lvl w:ilvl="8" w:tentative="1">
+      <w:start w:val="1"/>
+      <w:numFmt w:val="bullet"/>
+      <w:lvlText w:val=""/>
+      <w:lvlJc w:val="left"/>
+      <w:pPr>
+        <w:tabs>
+          <w:tab w:val="num" w:pos="6480"/>
+        </w:tabs>
+        <w:ind w:left="6480" w:hanging="360"/>
+      </w:pPr>
+      <w:rPr>
+        <w:rFonts w:ascii="Wingdings" w:hAnsi="Wingdings" w:hint="default"/>
+        <w:sz w:val="20"/>
+      </w:rPr>
+    </w:lvl>
+  </w:abstractNum>
+  <w:abstractNum w:abstractNumId="12" w15:restartNumberingAfterBreak="0">
+    <w:nsid w:val="605B57C7"/>
+    <w:multiLevelType w:val="hybridMultilevel"/>
+    <w:tmpl w:val="66763172"/>
+    <w:lvl w:ilvl="0" w:tplc="04090001">
+      <w:start w:val="1"/>
+      <w:numFmt w:val="bullet"/>
+      <w:lvlText w:val=""/>
+      <w:lvlJc w:val="left"/>
+      <w:pPr>
+        <w:ind w:left="720" w:hanging="360"/>
+      </w:pPr>
+      <w:rPr>
+        <w:rFonts w:ascii="Symbol" w:hAnsi="Symbol" w:hint="default"/>
+      </w:rPr>
+    </w:lvl>
+    <w:lvl w:ilvl="1" w:tplc="04090003" w:tentative="1">
+      <w:start w:val="1"/>
+      <w:numFmt w:val="bullet"/>
+      <w:lvlText w:val="o"/>
+      <w:lvlJc w:val="left"/>
+      <w:pPr>
+        <w:ind w:left="1440" w:hanging="360"/>
+      </w:pPr>
+      <w:rPr>
+        <w:rFonts w:ascii="Courier New" w:hAnsi="Courier New" w:cs="Courier New" w:hint="default"/>
+      </w:rPr>
+    </w:lvl>
+    <w:lvl w:ilvl="2" w:tplc="04090005" w:tentative="1">
+      <w:start w:val="1"/>
+      <w:numFmt w:val="bullet"/>
+      <w:lvlText w:val=""/>
+      <w:lvlJc w:val="left"/>
+      <w:pPr>
+        <w:ind w:left="2160" w:hanging="360"/>
+      </w:pPr>
+      <w:rPr>
+        <w:rFonts w:ascii="Wingdings" w:hAnsi="Wingdings" w:hint="default"/>
+      </w:rPr>
+    </w:lvl>
+    <w:lvl w:ilvl="3" w:tplc="04090001" w:tentative="1">
+      <w:start w:val="1"/>
+      <w:numFmt w:val="bullet"/>
+      <w:lvlText w:val=""/>
+      <w:lvlJc w:val="left"/>
+      <w:pPr>
+        <w:ind w:left="2880" w:hanging="360"/>
+      </w:pPr>
+      <w:rPr>
+        <w:rFonts w:ascii="Symbol" w:hAnsi="Symbol" w:hint="default"/>
+      </w:rPr>
+    </w:lvl>
+    <w:lvl w:ilvl="4" w:tplc="04090003" w:tentative="1">
+      <w:start w:val="1"/>
+      <w:numFmt w:val="bullet"/>
+      <w:lvlText w:val="o"/>
+      <w:lvlJc w:val="left"/>
+      <w:pPr>
+        <w:ind w:left="3600" w:hanging="360"/>
+      </w:pPr>
+      <w:rPr>
+        <w:rFonts w:ascii="Courier New" w:hAnsi="Courier New" w:cs="Courier New" w:hint="default"/>
+      </w:rPr>
+    </w:lvl>
+    <w:lvl w:ilvl="5" w:tplc="04090005" w:tentative="1">
+      <w:start w:val="1"/>
+      <w:numFmt w:val="bullet"/>
+      <w:lvlText w:val=""/>
+      <w:lvlJc w:val="left"/>
+      <w:pPr>
+        <w:ind w:left="4320" w:hanging="360"/>
+      </w:pPr>
+      <w:rPr>
+        <w:rFonts w:ascii="Wingdings" w:hAnsi="Wingdings" w:hint="default"/>
+      </w:rPr>
+    </w:lvl>
+    <w:lvl w:ilvl="6" w:tplc="04090001" w:tentative="1">
+      <w:start w:val="1"/>
+      <w:numFmt w:val="bullet"/>
+      <w:lvlText w:val=""/>
+      <w:lvlJc w:val="left"/>
+      <w:pPr>
+        <w:ind w:left="5040" w:hanging="360"/>
+      </w:pPr>
+      <w:rPr>
+        <w:rFonts w:ascii="Symbol" w:hAnsi="Symbol" w:hint="default"/>
+      </w:rPr>
+    </w:lvl>
+    <w:lvl w:ilvl="7" w:tplc="04090003" w:tentative="1">
+      <w:start w:val="1"/>
+      <w:numFmt w:val="bullet"/>
+      <w:lvlText w:val="o"/>
+      <w:lvlJc w:val="left"/>
+      <w:pPr>
+        <w:ind w:left="5760" w:hanging="360"/>
+      </w:pPr>
+      <w:rPr>
+        <w:rFonts w:ascii="Courier New" w:hAnsi="Courier New" w:cs="Courier New" w:hint="default"/>
+      </w:rPr>
+    </w:lvl>
+    <w:lvl w:ilvl="8" w:tplc="04090005" w:tentative="1">
+      <w:start w:val="1"/>
+      <w:numFmt w:val="bullet"/>
+      <w:lvlText w:val=""/>
+      <w:lvlJc w:val="left"/>
+      <w:pPr>
+        <w:ind w:left="6480" w:hanging="360"/>
+      </w:pPr>
+      <w:rPr>
+        <w:rFonts w:ascii="Wingdings" w:hAnsi="Wingdings" w:hint="default"/>
+      </w:rPr>
+    </w:lvl>
+  </w:abstractNum>
+  <w:abstractNum w:abstractNumId="13" w15:restartNumberingAfterBreak="0">
     <w:nsid w:val="637602D8"/>
     <w:multiLevelType w:val="hybridMultilevel"/>
     <w:tmpl w:val="8272B554"/>
@@ -3762,7 +6914,7 @@
       </w:pPr>
     </w:lvl>
   </w:abstractNum>
-  <w:abstractNum w:abstractNumId="10" w15:restartNumberingAfterBreak="0">
+  <w:abstractNum w:abstractNumId="14" w15:restartNumberingAfterBreak="0">
     <w:nsid w:val="676D00CC"/>
     <w:multiLevelType w:val="multilevel"/>
     <w:tmpl w:val="6FBE651E"/>
@@ -3911,7 +7063,156 @@
       </w:rPr>
     </w:lvl>
   </w:abstractNum>
-  <w:abstractNum w:abstractNumId="11" w15:restartNumberingAfterBreak="0">
+  <w:abstractNum w:abstractNumId="15" w15:restartNumberingAfterBreak="0">
+    <w:nsid w:val="6C88624B"/>
+    <w:multiLevelType w:val="multilevel"/>
+    <w:tmpl w:val="541C17F4"/>
+    <w:lvl w:ilvl="0">
+      <w:start w:val="1"/>
+      <w:numFmt w:val="bullet"/>
+      <w:lvlText w:val=""/>
+      <w:lvlJc w:val="left"/>
+      <w:pPr>
+        <w:tabs>
+          <w:tab w:val="num" w:pos="720"/>
+        </w:tabs>
+        <w:ind w:left="720" w:hanging="360"/>
+      </w:pPr>
+      <w:rPr>
+        <w:rFonts w:ascii="Symbol" w:hAnsi="Symbol" w:hint="default"/>
+        <w:sz w:val="20"/>
+      </w:rPr>
+    </w:lvl>
+    <w:lvl w:ilvl="1" w:tentative="1">
+      <w:start w:val="1"/>
+      <w:numFmt w:val="bullet"/>
+      <w:lvlText w:val="o"/>
+      <w:lvlJc w:val="left"/>
+      <w:pPr>
+        <w:tabs>
+          <w:tab w:val="num" w:pos="1440"/>
+        </w:tabs>
+        <w:ind w:left="1440" w:hanging="360"/>
+      </w:pPr>
+      <w:rPr>
+        <w:rFonts w:ascii="Courier New" w:hAnsi="Courier New" w:hint="default"/>
+        <w:sz w:val="20"/>
+      </w:rPr>
+    </w:lvl>
+    <w:lvl w:ilvl="2" w:tentative="1">
+      <w:start w:val="1"/>
+      <w:numFmt w:val="bullet"/>
+      <w:lvlText w:val=""/>
+      <w:lvlJc w:val="left"/>
+      <w:pPr>
+        <w:tabs>
+          <w:tab w:val="num" w:pos="2160"/>
+        </w:tabs>
+        <w:ind w:left="2160" w:hanging="360"/>
+      </w:pPr>
+      <w:rPr>
+        <w:rFonts w:ascii="Wingdings" w:hAnsi="Wingdings" w:hint="default"/>
+        <w:sz w:val="20"/>
+      </w:rPr>
+    </w:lvl>
+    <w:lvl w:ilvl="3" w:tentative="1">
+      <w:start w:val="1"/>
+      <w:numFmt w:val="bullet"/>
+      <w:lvlText w:val=""/>
+      <w:lvlJc w:val="left"/>
+      <w:pPr>
+        <w:tabs>
+          <w:tab w:val="num" w:pos="2880"/>
+        </w:tabs>
+        <w:ind w:left="2880" w:hanging="360"/>
+      </w:pPr>
+      <w:rPr>
+        <w:rFonts w:ascii="Wingdings" w:hAnsi="Wingdings" w:hint="default"/>
+        <w:sz w:val="20"/>
+      </w:rPr>
+    </w:lvl>
+    <w:lvl w:ilvl="4" w:tentative="1">
+      <w:start w:val="1"/>
+      <w:numFmt w:val="bullet"/>
+      <w:lvlText w:val=""/>
+      <w:lvlJc w:val="left"/>
+      <w:pPr>
+        <w:tabs>
+          <w:tab w:val="num" w:pos="3600"/>
+        </w:tabs>
+        <w:ind w:left="3600" w:hanging="360"/>
+      </w:pPr>
+      <w:rPr>
+        <w:rFonts w:ascii="Wingdings" w:hAnsi="Wingdings" w:hint="default"/>
+        <w:sz w:val="20"/>
+      </w:rPr>
+    </w:lvl>
+    <w:lvl w:ilvl="5" w:tentative="1">
+      <w:start w:val="1"/>
+      <w:numFmt w:val="bullet"/>
+      <w:lvlText w:val=""/>
+      <w:lvlJc w:val="left"/>
+      <w:pPr>
+        <w:tabs>
+          <w:tab w:val="num" w:pos="4320"/>
+        </w:tabs>
+        <w:ind w:left="4320" w:hanging="360"/>
+      </w:pPr>
+      <w:rPr>
+        <w:rFonts w:ascii="Wingdings" w:hAnsi="Wingdings" w:hint="default"/>
+        <w:sz w:val="20"/>
+      </w:rPr>
+    </w:lvl>
+    <w:lvl w:ilvl="6" w:tentative="1">
+      <w:start w:val="1"/>
+      <w:numFmt w:val="bullet"/>
+      <w:lvlText w:val=""/>
+      <w:lvlJc w:val="left"/>
+      <w:pPr>
+        <w:tabs>
+          <w:tab w:val="num" w:pos="5040"/>
+        </w:tabs>
+        <w:ind w:left="5040" w:hanging="360"/>
+      </w:pPr>
+      <w:rPr>
+        <w:rFonts w:ascii="Wingdings" w:hAnsi="Wingdings" w:hint="default"/>
+        <w:sz w:val="20"/>
+      </w:rPr>
+    </w:lvl>
+    <w:lvl w:ilvl="7" w:tentative="1">
+      <w:start w:val="1"/>
+      <w:numFmt w:val="bullet"/>
+      <w:lvlText w:val=""/>
+      <w:lvlJc w:val="left"/>
+      <w:pPr>
+        <w:tabs>
+          <w:tab w:val="num" w:pos="5760"/>
+        </w:tabs>
+        <w:ind w:left="5760" w:hanging="360"/>
+      </w:pPr>
+      <w:rPr>
+        <w:rFonts w:ascii="Wingdings" w:hAnsi="Wingdings" w:hint="default"/>
+        <w:sz w:val="20"/>
+      </w:rPr>
+    </w:lvl>
+    <w:lvl w:ilvl="8" w:tentative="1">
+      <w:start w:val="1"/>
+      <w:numFmt w:val="bullet"/>
+      <w:lvlText w:val=""/>
+      <w:lvlJc w:val="left"/>
+      <w:pPr>
+        <w:tabs>
+          <w:tab w:val="num" w:pos="6480"/>
+        </w:tabs>
+        <w:ind w:left="6480" w:hanging="360"/>
+      </w:pPr>
+      <w:rPr>
+        <w:rFonts w:ascii="Wingdings" w:hAnsi="Wingdings" w:hint="default"/>
+        <w:sz w:val="20"/>
+      </w:rPr>
+    </w:lvl>
+  </w:abstractNum>
+  <w:abstractNum w:abstractNumId="16" w15:restartNumberingAfterBreak="0">
     <w:nsid w:val="78884ACC"/>
     <w:multiLevelType w:val="hybridMultilevel"/>
     <w:tmpl w:val="8B8053B8"/>
@@ -4024,7 +7325,7 @@
       </w:rPr>
     </w:lvl>
   </w:abstractNum>
-  <w:abstractNum w:abstractNumId="12" w15:restartNumberingAfterBreak="0">
+  <w:abstractNum w:abstractNumId="17" w15:restartNumberingAfterBreak="0">
     <w:nsid w:val="78A10D53"/>
     <w:multiLevelType w:val="hybridMultilevel"/>
     <w:tmpl w:val="1598ABE6"/>
@@ -4137,7 +7438,7 @@
       </w:rPr>
     </w:lvl>
   </w:abstractNum>
-  <w:abstractNum w:abstractNumId="13" w15:restartNumberingAfterBreak="0">
+  <w:abstractNum w:abstractNumId="18" w15:restartNumberingAfterBreak="0">
     <w:nsid w:val="7E0B48A5"/>
     <w:multiLevelType w:val="multilevel"/>
     <w:tmpl w:val="67A24866"/>
@@ -4287,16 +7588,16 @@
     </w:lvl>
   </w:abstractNum>
   <w:num w:numId="1" w16cid:durableId="442380123">
-    <w:abstractNumId w:val="11"/>
+    <w:abstractNumId w:val="16"/>
   </w:num>
   <w:num w:numId="2" w16cid:durableId="523516382">
-    <w:abstractNumId w:val="7"/>
+    <w:abstractNumId w:val="9"/>
   </w:num>
   <w:num w:numId="3" w16cid:durableId="1953436499">
     <w:abstractNumId w:val="1"/>
   </w:num>
   <w:num w:numId="4" w16cid:durableId="1626738928">
-    <w:abstractNumId w:val="13"/>
+    <w:abstractNumId w:val="18"/>
   </w:num>
   <w:num w:numId="5" w16cid:durableId="64377108">
     <w:abstractNumId w:val="4"/>
@@ -4305,28 +7606,43 @@
     <w:abstractNumId w:val="2"/>
   </w:num>
   <w:num w:numId="7" w16cid:durableId="775827493">
-    <w:abstractNumId w:val="8"/>
+    <w:abstractNumId w:val="10"/>
   </w:num>
   <w:num w:numId="8" w16cid:durableId="195430559">
-    <w:abstractNumId w:val="12"/>
+    <w:abstractNumId w:val="17"/>
   </w:num>
   <w:num w:numId="9" w16cid:durableId="1584752317">
     <w:abstractNumId w:val="3"/>
   </w:num>
   <w:num w:numId="10" w16cid:durableId="299115414">
-    <w:abstractNumId w:val="9"/>
+    <w:abstractNumId w:val="13"/>
   </w:num>
   <w:num w:numId="11" w16cid:durableId="500587300">
-    <w:abstractNumId w:val="5"/>
+    <w:abstractNumId w:val="7"/>
   </w:num>
   <w:num w:numId="12" w16cid:durableId="1632175734">
-    <w:abstractNumId w:val="10"/>
+    <w:abstractNumId w:val="14"/>
   </w:num>
   <w:num w:numId="13" w16cid:durableId="281501970">
     <w:abstractNumId w:val="0"/>
   </w:num>
   <w:num w:numId="14" w16cid:durableId="1813323320">
+    <w:abstractNumId w:val="8"/>
+  </w:num>
+  <w:num w:numId="15" w16cid:durableId="780535518">
+    <w:abstractNumId w:val="15"/>
+  </w:num>
+  <w:num w:numId="16" w16cid:durableId="179394215">
     <w:abstractNumId w:val="6"/>
+  </w:num>
+  <w:num w:numId="17" w16cid:durableId="1724595221">
+    <w:abstractNumId w:val="11"/>
+  </w:num>
+  <w:num w:numId="18" w16cid:durableId="864058098">
+    <w:abstractNumId w:val="12"/>
+  </w:num>
+  <w:num w:numId="19" w16cid:durableId="1248347848">
+    <w:abstractNumId w:val="5"/>
   </w:num>
 </w:numbering>
 </file>
@@ -4867,7 +8183,6 @@
     <w:next w:val="Normal"/>
     <w:link w:val="Heading7Char"/>
     <w:uiPriority w:val="9"/>
-    <w:semiHidden/>
     <w:unhideWhenUsed/>
     <w:qFormat/>
     <w:rsid w:val="00B913A5"/>
@@ -5033,7 +8348,6 @@
     <w:basedOn w:val="DefaultParagraphFont"/>
     <w:link w:val="Heading7"/>
     <w:uiPriority w:val="9"/>
-    <w:semiHidden/>
     <w:rsid w:val="00B913A5"/>
     <w:rPr>
       <w:rFonts w:eastAsiaTheme="majorEastAsia" w:cstheme="majorBidi"/>

</xml_diff>